<commit_message>
feat: configurable chamfer threshold, v1.8.0 manuals, build script
- Preferences > Checks: chamfer width threshold for Hard Edges
  (default 0.5% of the object bbox diagonal) replaces the hardcoded
  BEVEL_WIDTH_RATIO;
- manuals RU/EN regenerated for v1.8.0: new Hard Edges semantics,
  the Updates block, current version strings;
- build.py: release checklist (commits since last tag, dirty-tree
  warning) + deterministic whitelist zip builder.
</commit_message>
<xml_diff>
--- a/docs/STUKACH_Manual_EN.docx
+++ b/docs/STUKACH_Manual_EN.docx
@@ -104,7 +104,7 @@
                 <w:sz w:val="18"/>
                 <w:spacing w:val="60"/>
               </w:rPr>
-              <w:t>BLENDER 5.2  -  V1.7.6  ·  MAYA 2025 - V1.3.0</w:t>
+              <w:t>BLENDER 5.2  -  V1.8.0  ·  MAYA 2025 - V1.3.0</w:t>
             </w:r>
           </w:p>
           <w:p>
@@ -173,7 +173,6 @@
           <w:left w:val="single" w:sz="24" w:space="8" w:color="C82823"/>
         </w:pBdr>
       </w:pPr>
-      <w:bookmarkStart w:id="100000" w:name="_Toc100000"/>
       <w:r>
         <w:rPr>
           <w:rFonts w:ascii="Century Gothic" w:hAnsi="Century Gothic"/>
@@ -183,223 +182,6 @@
           <w:spacing w:val="20"/>
         </w:rPr>
         <w:t>CONTENTS</w:t>
-      </w:r>
-      <w:bookmarkEnd w:id="100000"/>
-    </w:p>
-    <w:p>
-      <w:pPr>
-        <w:pStyle w:val="9"/>
-        <w:tabs>
-          <w:tab w:val="right" w:leader="dot" w:pos="9026"/>
-        </w:tabs>
-        <w:spacing w:before="120" w:after="60"/>
-      </w:pPr>
-      <w:r>
-        <w:t>1. About STUKACH</w:t>
-      </w:r>
-      <w:r>
-        <w:tab/>
-      </w:r>
-      <w:r>
-        <w:t>3</w:t>
-      </w:r>
-    </w:p>
-    <w:p>
-      <w:pPr>
-        <w:pStyle w:val="9"/>
-        <w:tabs>
-          <w:tab w:val="right" w:leader="dot" w:pos="9026"/>
-        </w:tabs>
-        <w:spacing w:before="120" w:after="60"/>
-      </w:pPr>
-      <w:r>
-        <w:t>2. Installation</w:t>
-      </w:r>
-      <w:r>
-        <w:tab/>
-      </w:r>
-      <w:r>
-        <w:t>4</w:t>
-      </w:r>
-    </w:p>
-    <w:p>
-      <w:pPr>
-        <w:pStyle w:val="9"/>
-        <w:tabs>
-          <w:tab w:val="right" w:leader="dot" w:pos="9026"/>
-        </w:tabs>
-        <w:spacing w:before="120" w:after="60"/>
-      </w:pPr>
-      <w:r>
-        <w:t>3. Quick start (Blender)</w:t>
-      </w:r>
-      <w:r>
-        <w:tab/>
-      </w:r>
-      <w:r>
-        <w:t>5</w:t>
-      </w:r>
-    </w:p>
-    <w:p>
-      <w:pPr>
-        <w:pStyle w:val="9"/>
-        <w:tabs>
-          <w:tab w:val="right" w:leader="dot" w:pos="9026"/>
-        </w:tabs>
-        <w:spacing w:before="120" w:after="60"/>
-      </w:pPr>
-      <w:r>
-        <w:t>4. Blender version interface</w:t>
-      </w:r>
-      <w:r>
-        <w:tab/>
-      </w:r>
-      <w:r>
-        <w:t>5</w:t>
-      </w:r>
-    </w:p>
-    <w:p>
-      <w:pPr>
-        <w:pStyle w:val="9"/>
-        <w:tabs>
-          <w:tab w:val="right" w:leader="dot" w:pos="9026"/>
-        </w:tabs>
-        <w:spacing w:before="120" w:after="60"/>
-      </w:pPr>
-      <w:r>
-        <w:t>5. Checkers (Blender)</w:t>
-      </w:r>
-      <w:r>
-        <w:tab/>
-      </w:r>
-      <w:r>
-        <w:t>8</w:t>
-      </w:r>
-    </w:p>
-    <w:p>
-      <w:pPr>
-        <w:pStyle w:val="9"/>
-        <w:tabs>
-          <w:tab w:val="right" w:leader="dot" w:pos="9026"/>
-        </w:tabs>
-        <w:spacing w:before="120" w:after="60"/>
-      </w:pPr>
-      <w:r>
-        <w:t>6. The hierarchy validator</w:t>
-      </w:r>
-      <w:r>
-        <w:tab/>
-      </w:r>
-      <w:r>
-        <w:t>13</w:t>
-      </w:r>
-    </w:p>
-    <w:p>
-      <w:pPr>
-        <w:pStyle w:val="9"/>
-        <w:tabs>
-          <w:tab w:val="right" w:leader="dot" w:pos="9026"/>
-        </w:tabs>
-        <w:spacing w:before="120" w:after="60"/>
-      </w:pPr>
-      <w:r>
-        <w:t>7. Viewport overlays</w:t>
-      </w:r>
-      <w:r>
-        <w:tab/>
-      </w:r>
-      <w:r>
-        <w:t>14</w:t>
-      </w:r>
-    </w:p>
-    <w:p>
-      <w:pPr>
-        <w:pStyle w:val="9"/>
-        <w:tabs>
-          <w:tab w:val="right" w:leader="dot" w:pos="9026"/>
-        </w:tabs>
-        <w:spacing w:before="120" w:after="60"/>
-      </w:pPr>
-      <w:r>
-        <w:t>8. Modes and tools</w:t>
-      </w:r>
-      <w:r>
-        <w:tab/>
-      </w:r>
-      <w:r>
-        <w:t>15</w:t>
-      </w:r>
-    </w:p>
-    <w:p>
-      <w:pPr>
-        <w:pStyle w:val="9"/>
-        <w:tabs>
-          <w:tab w:val="right" w:leader="dot" w:pos="9026"/>
-        </w:tabs>
-        <w:spacing w:before="120" w:after="60"/>
-      </w:pPr>
-      <w:r>
-        <w:t>9. Preferences</w:t>
-      </w:r>
-      <w:r>
-        <w:tab/>
-      </w:r>
-      <w:r>
-        <w:t>16</w:t>
-      </w:r>
-    </w:p>
-    <w:p>
-      <w:pPr>
-        <w:pStyle w:val="9"/>
-        <w:tabs>
-          <w:tab w:val="right" w:leader="dot" w:pos="9026"/>
-        </w:tabs>
-        <w:spacing w:before="120" w:after="60"/>
-      </w:pPr>
-      <w:r>
-        <w:t>10. How to use</w:t>
-      </w:r>
-      <w:r>
-        <w:tab/>
-      </w:r>
-      <w:r>
-        <w:t>16</w:t>
-      </w:r>
-    </w:p>
-    <w:p>
-      <w:pPr>
-        <w:pStyle w:val="9"/>
-        <w:tabs>
-          <w:tab w:val="right" w:leader="dot" w:pos="9026"/>
-        </w:tabs>
-        <w:spacing w:before="120" w:after="60"/>
-      </w:pPr>
-      <w:r>
-        <w:t>11. The Maya version</w:t>
-      </w:r>
-      <w:r>
-        <w:tab/>
-      </w:r>
-      <w:r>
-        <w:t>17</w:t>
-      </w:r>
-    </w:p>
-    <w:p>
-      <w:pPr>
-        <w:pStyle w:val="9"/>
-        <w:tabs>
-          <w:tab w:val="right" w:leader="dot" w:pos="9026"/>
-        </w:tabs>
-        <w:spacing w:before="120" w:after="60"/>
-      </w:pPr>
-      <w:r>
-        <w:t>12. Troubleshooting</w:t>
-      </w:r>
-      <w:r>
-        <w:tab/>
-      </w:r>
-      <w:r>
-        <w:t>18</w:t>
       </w:r>
     </w:p>
     <w:p>
@@ -424,7 +206,6 @@
           <w:left w:val="single" w:sz="24" w:space="8" w:color="C82823"/>
         </w:pBdr>
       </w:pPr>
-      <w:bookmarkStart w:id="100001" w:name="_Toc100001"/>
       <w:r>
         <w:rPr>
           <w:rFonts w:ascii="Century Gothic" w:hAnsi="Century Gothic"/>
@@ -444,17 +225,14 @@
         </w:rPr>
         <w:t>ABOUT STUKACH</w:t>
       </w:r>
-      <w:bookmarkEnd w:id="100001"/>
     </w:p>
     <w:p>
       <w:pPr>
         <w:pStyle w:val="Heading2"/>
       </w:pPr>
-      <w:bookmarkStart w:id="100002" w:name="_Toc100002"/>
       <w:r>
         <w:t>1.1 What STUKACH does</w:t>
       </w:r>
-      <w:bookmarkEnd w:id="100002"/>
     </w:p>
     <w:p>
       <w:r>
@@ -594,11 +372,9 @@
       <w:pPr>
         <w:pStyle w:val="Heading2"/>
       </w:pPr>
-      <w:bookmarkStart w:id="100003" w:name="_Toc100003"/>
       <w:r>
         <w:t>1.2 Philosophy: three severity levels</w:t>
       </w:r>
-      <w:bookmarkEnd w:id="100003"/>
     </w:p>
     <w:p>
       <w:r>
@@ -946,11 +722,9 @@
       <w:pPr>
         <w:pStyle w:val="Heading2"/>
       </w:pPr>
-      <w:bookmarkStart w:id="100004" w:name="_Toc100004"/>
       <w:r>
         <w:t>1.3 Two modes: Artist and Coordinator</w:t>
       </w:r>
-      <w:bookmarkEnd w:id="100004"/>
     </w:p>
     <w:p>
       <w:r>
@@ -967,11 +741,9 @@
       <w:pPr>
         <w:pStyle w:val="Heading2"/>
       </w:pPr>
-      <w:bookmarkStart w:id="100005" w:name="_Toc100005"/>
       <w:r>
         <w:t>1.4 Two versions</w:t>
       </w:r>
-      <w:bookmarkEnd w:id="100005"/>
     </w:p>
     <w:tbl>
       <w:tblPr>
@@ -1117,7 +889,7 @@
                 <w:color w:val="1A1A1A"/>
                 <w:sz w:val="18"/>
               </w:rPr>
-              <w:t>v1.7.6</w:t>
+              <w:t>v1.8.0</w:t>
             </w:r>
           </w:p>
         </w:tc>
@@ -1552,7 +1324,6 @@
           <w:left w:val="single" w:sz="24" w:space="8" w:color="C82823"/>
         </w:pBdr>
       </w:pPr>
-      <w:bookmarkStart w:id="100006" w:name="_Toc100006"/>
       <w:r>
         <w:rPr>
           <w:rFonts w:ascii="Century Gothic" w:hAnsi="Century Gothic"/>
@@ -1572,17 +1343,14 @@
         </w:rPr>
         <w:t>INSTALLATION</w:t>
       </w:r>
-      <w:bookmarkEnd w:id="100006"/>
     </w:p>
     <w:p>
       <w:pPr>
         <w:pStyle w:val="Heading2"/>
       </w:pPr>
-      <w:bookmarkStart w:id="100007" w:name="_Toc100007"/>
       <w:r>
         <w:t>2.1 Blender 5.1+</w:t>
       </w:r>
-      <w:bookmarkEnd w:id="100007"/>
     </w:p>
     <w:p>
       <w:pPr>
@@ -1669,11 +1437,9 @@
       <w:pPr>
         <w:pStyle w:val="Heading2"/>
       </w:pPr>
-      <w:bookmarkStart w:id="100008" w:name="_Toc100008"/>
       <w:r>
         <w:t>2.2 Maya 2025 (Windows x64)</w:t>
       </w:r>
-      <w:bookmarkEnd w:id="100008"/>
     </w:p>
     <w:p>
       <w:pPr>
@@ -1763,7 +1529,6 @@
           <w:left w:val="single" w:sz="24" w:space="8" w:color="C82823"/>
         </w:pBdr>
       </w:pPr>
-      <w:bookmarkStart w:id="100009" w:name="_Toc100009"/>
       <w:r>
         <w:rPr>
           <w:rFonts w:ascii="Century Gothic" w:hAnsi="Century Gothic"/>
@@ -1783,7 +1548,6 @@
         </w:rPr>
         <w:t>QUICK START (BLENDER)</w:t>
       </w:r>
-      <w:bookmarkEnd w:id="100009"/>
     </w:p>
     <w:p>
       <w:r>
@@ -1884,7 +1648,6 @@
           <w:left w:val="single" w:sz="24" w:space="8" w:color="C82823"/>
         </w:pBdr>
       </w:pPr>
-      <w:bookmarkStart w:id="100010" w:name="_Toc100010"/>
       <w:r>
         <w:rPr>
           <w:rFonts w:ascii="Century Gothic" w:hAnsi="Century Gothic"/>
@@ -1904,7 +1667,6 @@
         </w:rPr>
         <w:t>BLENDER VERSION INTERFACE</w:t>
       </w:r>
-      <w:bookmarkEnd w:id="100010"/>
     </w:p>
     <w:p>
       <w:r>
@@ -1921,11 +1683,9 @@
       <w:pPr>
         <w:pStyle w:val="Heading2"/>
       </w:pPr>
-      <w:bookmarkStart w:id="100011" w:name="_Toc100011"/>
       <w:r>
         <w:t>4.1 Run and modes</w:t>
       </w:r>
-      <w:bookmarkEnd w:id="100011"/>
     </w:p>
     <w:tbl>
       <w:tblPr>
@@ -2165,11 +1925,9 @@
       <w:pPr>
         <w:pStyle w:val="Heading2"/>
       </w:pPr>
-      <w:bookmarkStart w:id="100012" w:name="_Toc100012"/>
       <w:r>
         <w:t>4.2 Score and navigation</w:t>
       </w:r>
-      <w:bookmarkEnd w:id="100012"/>
     </w:p>
     <w:tbl>
       <w:tblPr>
@@ -2462,11 +2220,9 @@
       <w:pPr>
         <w:pStyle w:val="Heading2"/>
       </w:pPr>
-      <w:bookmarkStart w:id="100013" w:name="_Toc100013"/>
       <w:r>
         <w:t>4.3 Validation scope</w:t>
       </w:r>
-      <w:bookmarkEnd w:id="100013"/>
     </w:p>
     <w:tbl>
       <w:tblPr>
@@ -2759,11 +2515,9 @@
       <w:pPr>
         <w:pStyle w:val="Heading2"/>
       </w:pPr>
-      <w:bookmarkStart w:id="100014" w:name="_Toc100014"/>
       <w:r>
         <w:t>4.4 The Pipeline Checks block</w:t>
       </w:r>
-      <w:bookmarkEnd w:id="100014"/>
     </w:p>
     <w:p>
       <w:r>
@@ -3067,11 +2821,9 @@
       <w:pPr>
         <w:pStyle w:val="Heading2"/>
       </w:pPr>
-      <w:bookmarkStart w:id="100015" w:name="_Toc100015"/>
       <w:r>
         <w:t>4.5 The hierarchy block</w:t>
       </w:r>
-      <w:bookmarkEnd w:id="100015"/>
     </w:p>
     <w:p>
       <w:r>
@@ -3088,11 +2840,9 @@
       <w:pPr>
         <w:pStyle w:val="Heading2"/>
       </w:pPr>
-      <w:bookmarkStart w:id="100016" w:name="_Toc100016"/>
       <w:r>
         <w:t>4.6 The Objects list</w:t>
       </w:r>
-      <w:bookmarkEnd w:id="100016"/>
     </w:p>
     <w:tbl>
       <w:tblPr>
@@ -3544,11 +3294,9 @@
       <w:pPr>
         <w:pStyle w:val="Heading2"/>
       </w:pPr>
-      <w:bookmarkStart w:id="100017" w:name="_Toc100017"/>
       <w:r>
         <w:t>4.7 Asset Status and export</w:t>
       </w:r>
-      <w:bookmarkEnd w:id="100017"/>
     </w:p>
     <w:tbl>
       <w:tblPr>
@@ -3894,11 +3642,9 @@
       <w:pPr>
         <w:pStyle w:val="Heading2"/>
       </w:pPr>
-      <w:bookmarkStart w:id="100018" w:name="_Toc100018"/>
       <w:r>
         <w:t>4.8 The Coordinator panel</w:t>
       </w:r>
-      <w:bookmarkEnd w:id="100018"/>
     </w:p>
     <w:p>
       <w:r>
@@ -3918,7 +3664,6 @@
           <w:left w:val="single" w:sz="24" w:space="8" w:color="C82823"/>
         </w:pBdr>
       </w:pPr>
-      <w:bookmarkStart w:id="100019" w:name="_Toc100019"/>
       <w:r>
         <w:rPr>
           <w:rFonts w:ascii="Century Gothic" w:hAnsi="Century Gothic"/>
@@ -3938,7 +3683,6 @@
         </w:rPr>
         <w:t>CHECKERS (BLENDER)</w:t>
       </w:r>
-      <w:bookmarkEnd w:id="100019"/>
     </w:p>
     <w:p>
       <w:r>
@@ -3948,18 +3692,27 @@
           <w:color w:val="1A1A1A"/>
           <w:sz w:val="19"/>
         </w:rPr>
-        <w:t>42 checks in 7 categories + Scene Units. The set and severity match the v1.7.6 code; thresholds of some checks are configurable in Preferences (the UV tab).</w:t>
+        <w:t>42 checks in 7 categories + Scene Units. The set and severity match the v1.8.0 code; thresholds of some checks are configurable in Preferences (the UV tab, the Checks tab - the Hard Edges chamfer width).</w:t>
+      </w:r>
+    </w:p>
+    <w:p>
+      <w:r>
+        <w:rPr>
+          <w:rFonts w:ascii="Arial" w:hAnsi="Arial"/>
+          <w:i w:val="0"/>
+          <w:color w:val="1A1A1A"/>
+          <w:sz w:val="19"/>
+        </w:rPr>
+        <w:t>Preferences - Updates: checks for a new version (a button plus an optional daily auto-check). When a newer release exists, a badge in the panel links to the download.</w:t>
       </w:r>
     </w:p>
     <w:p>
       <w:pPr>
         <w:pStyle w:val="Heading2"/>
       </w:pPr>
-      <w:bookmarkStart w:id="100020" w:name="_Toc100020"/>
       <w:r>
         <w:t>5.1 Scene Units (scene)</w:t>
       </w:r>
-      <w:bookmarkEnd w:id="100020"/>
     </w:p>
     <w:tbl>
       <w:tblPr>
@@ -4191,11 +3944,9 @@
       <w:pPr>
         <w:pStyle w:val="Heading2"/>
       </w:pPr>
-      <w:bookmarkStart w:id="100021" w:name="_Toc100021"/>
       <w:r>
         <w:t>5.2 TOPOLOGY (14)</w:t>
       </w:r>
-      <w:bookmarkEnd w:id="100021"/>
     </w:p>
     <w:tbl>
       <w:tblPr>
@@ -5273,7 +5024,7 @@
                 <w:color w:val="1A1A1A"/>
                 <w:sz w:val="18"/>
               </w:rPr>
-              <w:t>Sharp edges (dihedral angle of 30 degrees or more) not marked Sharp</w:t>
+              <w:t>Smooth-shaded edges (dihedral angle of 30 degrees or more) between substantial faces, not marked Sharp</w:t>
             </w:r>
           </w:p>
         </w:tc>
@@ -5296,7 +5047,7 @@
                 <w:color w:val="1A1A1A"/>
                 <w:sz w:val="18"/>
               </w:rPr>
-              <w:t>Smooth shading on a sharp corner produces a shading artifact</w:t>
+              <w:t>Smooth shading on a sharp corner produces a shading artifact. Skipped: custom-normal meshes, chamfer strips (threshold in Preferences - Checks), flat-shaded pairs</w:t>
             </w:r>
           </w:p>
         </w:tc>
@@ -5703,11 +5454,9 @@
       <w:pPr>
         <w:pStyle w:val="Heading2"/>
       </w:pPr>
-      <w:bookmarkStart w:id="100022" w:name="_Toc100022"/>
       <w:r>
         <w:t>5.3 TRANSFORMS (6)</w:t>
       </w:r>
-      <w:bookmarkEnd w:id="100022"/>
     </w:p>
     <w:tbl>
       <w:tblPr>
@@ -6450,11 +6199,9 @@
       <w:pPr>
         <w:pStyle w:val="Heading2"/>
       </w:pPr>
-      <w:bookmarkStart w:id="100023" w:name="_Toc100023"/>
       <w:r>
         <w:t>5.4 SYMMETRY (3)</w:t>
       </w:r>
-      <w:bookmarkEnd w:id="100023"/>
     </w:p>
     <w:tbl>
       <w:tblPr>
@@ -6687,11 +6434,9 @@
       <w:pPr>
         <w:pStyle w:val="Heading2"/>
       </w:pPr>
-      <w:bookmarkStart w:id="100024" w:name="_Toc100024"/>
       <w:r>
         <w:t>5.5 UV (9)</w:t>
       </w:r>
-      <w:bookmarkEnd w:id="100024"/>
     </w:p>
     <w:tbl>
       <w:tblPr>
@@ -7740,11 +7485,9 @@
       <w:pPr>
         <w:pStyle w:val="Heading2"/>
       </w:pPr>
-      <w:bookmarkStart w:id="100025" w:name="_Toc100025"/>
       <w:r>
         <w:t>5.6 NAMING (6)</w:t>
       </w:r>
-      <w:bookmarkEnd w:id="100025"/>
     </w:p>
     <w:p>
       <w:r>
@@ -8498,11 +8241,9 @@
       <w:pPr>
         <w:pStyle w:val="Heading2"/>
       </w:pPr>
-      <w:bookmarkStart w:id="100026" w:name="_Toc100026"/>
       <w:r>
         <w:t>5.7 MATERIALS (3)</w:t>
       </w:r>
-      <w:bookmarkEnd w:id="100026"/>
     </w:p>
     <w:tbl>
       <w:tblPr>
@@ -8939,11 +8680,9 @@
       <w:pPr>
         <w:pStyle w:val="Heading2"/>
       </w:pPr>
-      <w:bookmarkStart w:id="100027" w:name="_Toc100027"/>
       <w:r>
         <w:t>5.8 CLEANUP (1)</w:t>
       </w:r>
-      <w:bookmarkEnd w:id="100027"/>
     </w:p>
     <w:tbl>
       <w:tblPr>
@@ -9179,7 +8918,6 @@
           <w:left w:val="single" w:sz="24" w:space="8" w:color="C82823"/>
         </w:pBdr>
       </w:pPr>
-      <w:bookmarkStart w:id="100028" w:name="_Toc100028"/>
       <w:r>
         <w:rPr>
           <w:rFonts w:ascii="Century Gothic" w:hAnsi="Century Gothic"/>
@@ -9199,17 +8937,14 @@
         </w:rPr>
         <w:t>THE HIERARCHY VALIDATOR</w:t>
       </w:r>
-      <w:bookmarkEnd w:id="100028"/>
     </w:p>
     <w:p>
       <w:pPr>
         <w:pStyle w:val="Heading2"/>
       </w:pPr>
-      <w:bookmarkStart w:id="100029" w:name="_Toc100029"/>
       <w:r>
         <w:t>6.1 Asset structure conventions</w:t>
       </w:r>
-      <w:bookmarkEnd w:id="100029"/>
     </w:p>
     <w:p>
       <w:r>
@@ -9310,11 +9045,9 @@
       <w:pPr>
         <w:pStyle w:val="Heading2"/>
       </w:pPr>
-      <w:bookmarkStart w:id="100030" w:name="_Toc100030"/>
       <w:r>
         <w:t>6.2 Rules (13)</w:t>
       </w:r>
-      <w:bookmarkEnd w:id="100030"/>
     </w:p>
     <w:tbl>
       <w:tblPr>
@@ -10399,11 +10132,9 @@
       <w:pPr>
         <w:pStyle w:val="Heading2"/>
       </w:pPr>
-      <w:bookmarkStart w:id="100031" w:name="_Toc100031"/>
       <w:r>
         <w:t>6.3 Scanning</w:t>
       </w:r>
-      <w:bookmarkEnd w:id="100031"/>
     </w:p>
     <w:p>
       <w:pPr>
@@ -10465,11 +10196,9 @@
       <w:pPr>
         <w:pStyle w:val="Heading2"/>
       </w:pPr>
-      <w:bookmarkStart w:id="100032" w:name="_Toc100032"/>
       <w:r>
         <w:t>6.4 Fixes</w:t>
       </w:r>
-      <w:bookmarkEnd w:id="100032"/>
     </w:p>
     <w:tbl>
       <w:tblPr>
@@ -10826,11 +10555,9 @@
       <w:pPr>
         <w:pStyle w:val="Heading2"/>
       </w:pPr>
-      <w:bookmarkStart w:id="100033" w:name="_Toc100033"/>
       <w:r>
         <w:t>6.5 The coordinator gate</w:t>
       </w:r>
-      <w:bookmarkEnd w:id="100033"/>
     </w:p>
     <w:p>
       <w:r>
@@ -10850,7 +10577,6 @@
           <w:left w:val="single" w:sz="24" w:space="8" w:color="C82823"/>
         </w:pBdr>
       </w:pPr>
-      <w:bookmarkStart w:id="100034" w:name="_Toc100034"/>
       <w:r>
         <w:rPr>
           <w:rFonts w:ascii="Century Gothic" w:hAnsi="Century Gothic"/>
@@ -10870,7 +10596,6 @@
         </w:rPr>
         <w:t>VIEWPORT OVERLAYS</w:t>
       </w:r>
-      <w:bookmarkEnd w:id="100034"/>
     </w:p>
     <w:p>
       <w:r>
@@ -11277,7 +11002,6 @@
           <w:left w:val="single" w:sz="24" w:space="8" w:color="C82823"/>
         </w:pBdr>
       </w:pPr>
-      <w:bookmarkStart w:id="100035" w:name="_Toc100035"/>
       <w:r>
         <w:rPr>
           <w:rFonts w:ascii="Century Gothic" w:hAnsi="Century Gothic"/>
@@ -11297,17 +11021,14 @@
         </w:rPr>
         <w:t>MODES AND TOOLS</w:t>
       </w:r>
-      <w:bookmarkEnd w:id="100035"/>
     </w:p>
     <w:p>
       <w:pPr>
         <w:pStyle w:val="Heading2"/>
       </w:pPr>
-      <w:bookmarkStart w:id="100036" w:name="_Toc100036"/>
       <w:r>
         <w:t>8.1 Live</w:t>
       </w:r>
-      <w:bookmarkEnd w:id="100036"/>
     </w:p>
     <w:p>
       <w:r>
@@ -11324,11 +11045,9 @@
       <w:pPr>
         <w:pStyle w:val="Heading2"/>
       </w:pPr>
-      <w:bookmarkStart w:id="100037" w:name="_Toc100037"/>
       <w:r>
         <w:t>8.2 Presets</w:t>
       </w:r>
-      <w:bookmarkEnd w:id="100037"/>
     </w:p>
     <w:p>
       <w:r>
@@ -11345,11 +11064,9 @@
       <w:pPr>
         <w:pStyle w:val="Heading2"/>
       </w:pPr>
-      <w:bookmarkStart w:id="100038" w:name="_Toc100038"/>
       <w:r>
         <w:t>8.3 Reports</w:t>
       </w:r>
-      <w:bookmarkEnd w:id="100038"/>
     </w:p>
     <w:tbl>
       <w:tblPr>
@@ -11697,11 +11414,9 @@
       <w:pPr>
         <w:pStyle w:val="Heading2"/>
       </w:pPr>
-      <w:bookmarkStart w:id="100039" w:name="_Toc100039"/>
       <w:r>
         <w:t>8.4 Fixes</w:t>
       </w:r>
-      <w:bookmarkEnd w:id="100039"/>
     </w:p>
     <w:p>
       <w:r>
@@ -11718,11 +11433,9 @@
       <w:pPr>
         <w:pStyle w:val="Heading2"/>
       </w:pPr>
-      <w:bookmarkStart w:id="100040" w:name="_Toc100040"/>
       <w:r>
         <w:t>8.5 Checkpoint</w:t>
       </w:r>
-      <w:bookmarkEnd w:id="100040"/>
     </w:p>
     <w:p>
       <w:r>
@@ -11739,11 +11452,9 @@
       <w:pPr>
         <w:pStyle w:val="Heading2"/>
       </w:pPr>
-      <w:bookmarkStart w:id="100041" w:name="_Toc100041"/>
       <w:r>
         <w:t>8.6 Pre-flight</w:t>
       </w:r>
-      <w:bookmarkEnd w:id="100041"/>
     </w:p>
     <w:p>
       <w:r>
@@ -11760,11 +11471,9 @@
       <w:pPr>
         <w:pStyle w:val="Heading2"/>
       </w:pPr>
-      <w:bookmarkStart w:id="100042" w:name="_Toc100042"/>
       <w:r>
         <w:t>8.7 Logs and diagnostics</w:t>
       </w:r>
-      <w:bookmarkEnd w:id="100042"/>
     </w:p>
     <w:p>
       <w:pPr>
@@ -11815,7 +11524,6 @@
           <w:left w:val="single" w:sz="24" w:space="8" w:color="C82823"/>
         </w:pBdr>
       </w:pPr>
-      <w:bookmarkStart w:id="100043" w:name="_Toc100043"/>
       <w:r>
         <w:rPr>
           <w:rFonts w:ascii="Century Gothic" w:hAnsi="Century Gothic"/>
@@ -11835,7 +11543,6 @@
         </w:rPr>
         <w:t>PREFERENCES</w:t>
       </w:r>
-      <w:bookmarkEnd w:id="100043"/>
     </w:p>
     <w:p>
       <w:r>
@@ -12195,7 +11902,6 @@
           <w:left w:val="single" w:sz="24" w:space="8" w:color="C82823"/>
         </w:pBdr>
       </w:pPr>
-      <w:bookmarkStart w:id="100044" w:name="_Toc100044"/>
       <w:r>
         <w:rPr>
           <w:rFonts w:ascii="Century Gothic" w:hAnsi="Century Gothic"/>
@@ -12215,17 +11921,14 @@
         </w:rPr>
         <w:t>HOW TO USE</w:t>
       </w:r>
-      <w:bookmarkEnd w:id="100044"/>
     </w:p>
     <w:p>
       <w:pPr>
         <w:pStyle w:val="Heading2"/>
       </w:pPr>
-      <w:bookmarkStart w:id="100045" w:name="_Toc100045"/>
       <w:r>
         <w:t>10.1 For the artist</w:t>
       </w:r>
-      <w:bookmarkEnd w:id="100045"/>
     </w:p>
     <w:p>
       <w:pPr>
@@ -12315,11 +12018,9 @@
       <w:pPr>
         <w:pStyle w:val="Heading2"/>
       </w:pPr>
-      <w:bookmarkStart w:id="100046" w:name="_Toc100046"/>
       <w:r>
         <w:t>10.2 For the coordinator</w:t>
       </w:r>
-      <w:bookmarkEnd w:id="100046"/>
     </w:p>
     <w:p>
       <w:pPr>
@@ -12398,7 +12099,6 @@
           <w:left w:val="single" w:sz="24" w:space="8" w:color="C82823"/>
         </w:pBdr>
       </w:pPr>
-      <w:bookmarkStart w:id="100047" w:name="_Toc100047"/>
       <w:r>
         <w:rPr>
           <w:rFonts w:ascii="Century Gothic" w:hAnsi="Century Gothic"/>
@@ -12418,17 +12118,14 @@
         </w:rPr>
         <w:t>THE MAYA VERSION</w:t>
       </w:r>
-      <w:bookmarkEnd w:id="100047"/>
     </w:p>
     <w:p>
       <w:pPr>
         <w:pStyle w:val="Heading2"/>
       </w:pPr>
-      <w:bookmarkStart w:id="100048" w:name="_Toc100048"/>
       <w:r>
         <w:t>11.1 The panel</w:t>
       </w:r>
-      <w:bookmarkEnd w:id="100048"/>
     </w:p>
     <w:p>
       <w:r>
@@ -12445,11 +12142,9 @@
       <w:pPr>
         <w:pStyle w:val="Heading2"/>
       </w:pPr>
-      <w:bookmarkStart w:id="100049" w:name="_Toc100049"/>
       <w:r>
         <w:t>11.2 Checks: 43 + two scene checks</w:t>
       </w:r>
-      <w:bookmarkEnd w:id="100049"/>
     </w:p>
     <w:tbl>
       <w:tblPr>
@@ -13171,11 +12866,9 @@
       <w:pPr>
         <w:pStyle w:val="Heading2"/>
       </w:pPr>
-      <w:bookmarkStart w:id="100050" w:name="_Toc100050"/>
       <w:r>
         <w:t>11.3 Speed: the snapshot and progressive validation</w:t>
       </w:r>
-      <w:bookmarkEnd w:id="100050"/>
     </w:p>
     <w:p>
       <w:r>
@@ -13203,11 +12896,9 @@
       <w:pPr>
         <w:pStyle w:val="Heading2"/>
       </w:pPr>
-      <w:bookmarkStart w:id="100051" w:name="_Toc100051"/>
       <w:r>
         <w:t>11.4 The overlay</w:t>
       </w:r>
-      <w:bookmarkEnd w:id="100051"/>
     </w:p>
     <w:p>
       <w:r>
@@ -13224,11 +12915,9 @@
       <w:pPr>
         <w:pStyle w:val="Heading2"/>
       </w:pPr>
-      <w:bookmarkStart w:id="100052" w:name="_Toc100052"/>
       <w:r>
         <w:t>11.5 Locator hierarchy</w:t>
       </w:r>
-      <w:bookmarkEnd w:id="100052"/>
     </w:p>
     <w:p>
       <w:pPr>
@@ -13276,11 +12965,9 @@
       <w:pPr>
         <w:pStyle w:val="Heading2"/>
       </w:pPr>
-      <w:bookmarkStart w:id="100053" w:name="_Toc100053"/>
       <w:r>
         <w:t>11.6 Maya version notes</w:t>
       </w:r>
-      <w:bookmarkEnd w:id="100053"/>
     </w:p>
     <w:p>
       <w:pPr>
@@ -13359,7 +13046,6 @@
           <w:left w:val="single" w:sz="24" w:space="8" w:color="C82823"/>
         </w:pBdr>
       </w:pPr>
-      <w:bookmarkStart w:id="100054" w:name="_Toc100054"/>
       <w:r>
         <w:rPr>
           <w:rFonts w:ascii="Century Gothic" w:hAnsi="Century Gothic"/>
@@ -13379,7 +13065,6 @@
         </w:rPr>
         <w:t>TROUBLESHOOTING</w:t>
       </w:r>
-      <w:bookmarkEnd w:id="100054"/>
     </w:p>
     <w:p>
       <w:r>
@@ -13663,7 +13348,7 @@
                 <w:color w:val="1A1A1A"/>
                 <w:sz w:val="18"/>
               </w:rPr>
-              <w:t>That is the X-Ray button in Pipeline Checks (v1.7.6): turn it off and the walls will hide the far-side markers. An enabled Alt+Z (viewport xray) also forces the overlay to be transparent.</w:t>
+              <w:t>That is the X-Ray button in Pipeline Checks (v1.7.5): turn it off and the walls will hide the far-side markers. An enabled Alt+Z (viewport xray) also forces the overlay to be transparent.</w:t>
             </w:r>
           </w:p>
         </w:tc>
@@ -26096,53 +25781,6 @@
       </w:tcPr>
     </w:tblStylePr>
   </w:style>
-  <w:style xmlns:w="http://schemas.openxmlformats.org/wordprocessingml/2006/main" w:type="paragraph" w:styleId="9">
-    <w:name w:val="toc 1"/>
-    <w:basedOn w:val="Normal"/>
-    <w:uiPriority w:val="39"/>
-    <w:pPr>
-      <w:tabs>
-        <w:tab w:val="right" w:leader="dot" w:pos="9026"/>
-      </w:tabs>
-      <w:spacing w:before="120" w:after="60"/>
-    </w:pPr>
-    <w:rPr>
-      <w:b/>
-      <w:bCs/>
-    </w:rPr>
-  </w:style>
-  <w:style xmlns:w="http://schemas.openxmlformats.org/wordprocessingml/2006/main" w:type="paragraph" w:styleId="11">
-    <w:name w:val="toc 2"/>
-    <w:basedOn w:val="Normal"/>
-    <w:uiPriority w:val="39"/>
-    <w:pPr>
-      <w:tabs>
-        <w:tab w:val="right" w:leader="dot" w:pos="9026"/>
-      </w:tabs>
-      <w:ind w:left="360"/>
-      <w:spacing w:before="60" w:after="40"/>
-    </w:pPr>
-  </w:style>
-  <w:style xmlns:w="http://schemas.openxmlformats.org/wordprocessingml/2006/main" w:type="paragraph" w:styleId="12">
-    <w:name w:val="toc 3"/>
-    <w:basedOn w:val="Normal"/>
-    <w:uiPriority w:val="39"/>
-    <w:pPr>
-      <w:tabs>
-        <w:tab w:val="right" w:leader="dot" w:pos="9026"/>
-      </w:tabs>
-      <w:ind w:left="720"/>
-      <w:spacing w:before="40" w:after="20"/>
-    </w:pPr>
-  </w:style>
-  <w:style xmlns:w="http://schemas.openxmlformats.org/wordprocessingml/2006/main" w:type="character" w:styleId="Hyperlink">
-    <w:name w:val="Hyperlink"/>
-    <w:uiPriority w:val="99"/>
-    <w:rPr>
-      <w:color w:val="0563C1"/>
-      <w:u w:val="single"/>
-    </w:rPr>
-  </w:style>
 </w:styles>
 </file>
 

</xml_diff>

<commit_message>
docs: dedicated Updates section (9.1) in both manuals
The update-checker note was a one-line paragraph buried in section 5 -
easy to miss. Now a proper subsection in Preferences: the daily toggle,
the manual button, the badge behavior, and how to install an update.
Also documents the Checks tab (chamfer width threshold).
</commit_message>
<xml_diff>
--- a/docs/STUKACH_Manual_EN.docx
+++ b/docs/STUKACH_Manual_EN.docx
@@ -3692,18 +3692,7 @@
           <w:color w:val="1A1A1A"/>
           <w:sz w:val="19"/>
         </w:rPr>
-        <w:t>42 checks in 7 categories + Scene Units. The set and severity match the v1.8.0 code; thresholds of some checks are configurable in Preferences (the UV tab, the Checks tab - the Hard Edges chamfer width).</w:t>
-      </w:r>
-    </w:p>
-    <w:p>
-      <w:r>
-        <w:rPr>
-          <w:rFonts w:ascii="Arial" w:hAnsi="Arial"/>
-          <w:i w:val="0"/>
-          <w:color w:val="1A1A1A"/>
-          <w:sz w:val="19"/>
-        </w:rPr>
-        <w:t>Preferences - Updates: checks for a new version (a button plus an optional daily auto-check). When a newer release exists, a badge in the panel links to the download.</w:t>
+        <w:t>42 checks in 7 categories + Scene Units. The set and severity match the v1.8.0 code; thresholds of some checks are configurable in Preferences (the UV tab, the Checks tab - the Hard Edges chamfer width). Update checking is described in section 9.1.</w:t>
       </w:r>
     </w:p>
     <w:p>
@@ -11552,7 +11541,7 @@
           <w:color w:val="1A1A1A"/>
           <w:sz w:val="19"/>
         </w:rPr>
-        <w:t>Preferences - Add-ons - STUKACH. Tabs: Interface, Overlay, UV, Naming, Colors.</w:t>
+        <w:t>Preferences - Add-ons - STUKACH. Tabs: Interface, Overlay, UV, Naming, Checks, Colors.</w:t>
       </w:r>
     </w:p>
     <w:tbl>
@@ -11847,6 +11836,59 @@
             <w:tcW w:type="dxa" w:w="1701"/>
             <w:vAlign w:val="top"/>
             <w:tcBorders>
+              <w:bottom w:val="single" w:sz="4" w:space="4" w:color="E0E0E0"/>
+            </w:tcBorders>
+          </w:tcPr>
+          <w:p>
+            <w:pPr>
+              <w:keepNext/>
+              <w:spacing w:before="40" w:after="40" w:line="264" w:lineRule="auto"/>
+            </w:pPr>
+            <w:r>
+              <w:rPr>
+                <w:rFonts w:ascii="Arial" w:hAnsi="Arial"/>
+                <w:b/>
+                <w:color w:val="1A1A1A"/>
+                <w:sz w:val="18"/>
+              </w:rPr>
+              <w:t>Checks</w:t>
+            </w:r>
+          </w:p>
+        </w:tc>
+        <w:tc>
+          <w:tcPr>
+            <w:tcW w:type="dxa" w:w="9071"/>
+            <w:vAlign w:val="top"/>
+            <w:tcBorders>
+              <w:bottom w:val="single" w:sz="4" w:space="4" w:color="E0E0E0"/>
+            </w:tcBorders>
+          </w:tcPr>
+          <w:p>
+            <w:pPr>
+              <w:keepNext/>
+              <w:spacing w:before="40" w:after="40" w:line="264" w:lineRule="auto"/>
+            </w:pPr>
+            <w:r>
+              <w:rPr>
+                <w:rFonts w:ascii="Arial" w:hAnsi="Arial"/>
+                <w:b w:val="0"/>
+                <w:color w:val="1A1A1A"/>
+                <w:sz w:val="18"/>
+              </w:rPr>
+              <w:t>Hard Edges: the chamfer width threshold. An edge hugging a strip thinner than this percentage of the object size is a chamfer and is not flagged.</w:t>
+            </w:r>
+          </w:p>
+        </w:tc>
+      </w:tr>
+      <w:tr>
+        <w:trPr>
+          <w:cantSplit/>
+        </w:trPr>
+        <w:tc>
+          <w:tcPr>
+            <w:tcW w:type="dxa" w:w="1701"/>
+            <w:vAlign w:val="top"/>
+            <w:tcBorders>
               <w:bottom w:val="single" w:sz="8" w:space="4" w:color="000000"/>
             </w:tcBorders>
           </w:tcPr>
@@ -11894,6 +11936,67 @@
       <w:pPr>
         <w:spacing w:after="80" w:line="240" w:lineRule="auto"/>
       </w:pPr>
+    </w:p>
+    <w:p>
+      <w:pPr>
+        <w:pStyle w:val="Heading2"/>
+      </w:pPr>
+      <w:r>
+        <w:t>9.1 Updates</w:t>
+      </w:r>
+    </w:p>
+    <w:p>
+      <w:r>
+        <w:rPr>
+          <w:rFonts w:ascii="Arial" w:hAnsi="Arial"/>
+          <w:i w:val="0"/>
+          <w:color w:val="1A1A1A"/>
+          <w:sz w:val="19"/>
+        </w:rPr>
+        <w:t>The Updates block: the Check for updates button compares the installed version with the latest GitHub release (one anonymous request, the UI never blocks).</w:t>
+      </w:r>
+    </w:p>
+    <w:p>
+      <w:pPr>
+        <w:pStyle w:val="ListBullet"/>
+      </w:pPr>
+      <w:r>
+        <w:rPr>
+          <w:rFonts w:ascii="Arial" w:hAnsi="Arial"/>
+          <w:i w:val="0"/>
+          <w:color w:val="1A1A1A"/>
+          <w:sz w:val="19"/>
+        </w:rPr>
+        <w:t>The Check for updates daily toggle (on by default) - a silent auto-check once a day; when there is nothing new, nothing appears anywhere.</w:t>
+      </w:r>
+    </w:p>
+    <w:p>
+      <w:pPr>
+        <w:pStyle w:val="ListBullet"/>
+      </w:pPr>
+      <w:r>
+        <w:rPr>
+          <w:rFonts w:ascii="Arial" w:hAnsi="Arial"/>
+          <w:i w:val="0"/>
+          <w:color w:val="1A1A1A"/>
+          <w:sz w:val="19"/>
+        </w:rPr>
+        <w:t>When an update exists: the Update available: X.Y.Z line in the Preferences becomes a link to the release page, and a badge appears at the top of the STUKACH panel.</w:t>
+      </w:r>
+    </w:p>
+    <w:p>
+      <w:pPr>
+        <w:pStyle w:val="ListBullet"/>
+      </w:pPr>
+      <w:r>
+        <w:rPr>
+          <w:rFonts w:ascii="Arial" w:hAnsi="Arial"/>
+          <w:i w:val="0"/>
+          <w:color w:val="1A1A1A"/>
+          <w:sz w:val="19"/>
+        </w:rPr>
+        <w:t>Install the update the usual way: download the zip from the release page and install it via Install from Disk (section 2); the badge goes away afterwards.</w:t>
+      </w:r>
     </w:p>
     <w:p>
       <w:pPr>

</xml_diff>

<commit_message>
docs: run the two-pass TOC finalization on regenerated manuals
</commit_message>
<xml_diff>
--- a/docs/STUKACH_Manual_EN.docx
+++ b/docs/STUKACH_Manual_EN.docx
@@ -173,6 +173,7 @@
           <w:left w:val="single" w:sz="24" w:space="8" w:color="C82823"/>
         </w:pBdr>
       </w:pPr>
+      <w:bookmarkStart w:id="100000" w:name="_Toc100000"/>
       <w:r>
         <w:rPr>
           <w:rFonts w:ascii="Century Gothic" w:hAnsi="Century Gothic"/>
@@ -182,6 +183,223 @@
           <w:spacing w:val="20"/>
         </w:rPr>
         <w:t>CONTENTS</w:t>
+      </w:r>
+      <w:bookmarkEnd w:id="100000"/>
+    </w:p>
+    <w:p>
+      <w:pPr>
+        <w:pStyle w:val="9"/>
+        <w:tabs>
+          <w:tab w:val="right" w:leader="dot" w:pos="9026"/>
+        </w:tabs>
+        <w:spacing w:before="120" w:after="60"/>
+      </w:pPr>
+      <w:r>
+        <w:t>1. About STUKACH</w:t>
+      </w:r>
+      <w:r>
+        <w:tab/>
+      </w:r>
+      <w:r>
+        <w:t>3</w:t>
+      </w:r>
+    </w:p>
+    <w:p>
+      <w:pPr>
+        <w:pStyle w:val="9"/>
+        <w:tabs>
+          <w:tab w:val="right" w:leader="dot" w:pos="9026"/>
+        </w:tabs>
+        <w:spacing w:before="120" w:after="60"/>
+      </w:pPr>
+      <w:r>
+        <w:t>2. Installation</w:t>
+      </w:r>
+      <w:r>
+        <w:tab/>
+      </w:r>
+      <w:r>
+        <w:t>4</w:t>
+      </w:r>
+    </w:p>
+    <w:p>
+      <w:pPr>
+        <w:pStyle w:val="9"/>
+        <w:tabs>
+          <w:tab w:val="right" w:leader="dot" w:pos="9026"/>
+        </w:tabs>
+        <w:spacing w:before="120" w:after="60"/>
+      </w:pPr>
+      <w:r>
+        <w:t>3. Quick start (Blender)</w:t>
+      </w:r>
+      <w:r>
+        <w:tab/>
+      </w:r>
+      <w:r>
+        <w:t>5</w:t>
+      </w:r>
+    </w:p>
+    <w:p>
+      <w:pPr>
+        <w:pStyle w:val="9"/>
+        <w:tabs>
+          <w:tab w:val="right" w:leader="dot" w:pos="9026"/>
+        </w:tabs>
+        <w:spacing w:before="120" w:after="60"/>
+      </w:pPr>
+      <w:r>
+        <w:t>4. Blender version interface</w:t>
+      </w:r>
+      <w:r>
+        <w:tab/>
+      </w:r>
+      <w:r>
+        <w:t>5</w:t>
+      </w:r>
+    </w:p>
+    <w:p>
+      <w:pPr>
+        <w:pStyle w:val="9"/>
+        <w:tabs>
+          <w:tab w:val="right" w:leader="dot" w:pos="9026"/>
+        </w:tabs>
+        <w:spacing w:before="120" w:after="60"/>
+      </w:pPr>
+      <w:r>
+        <w:t>5. Checkers (Blender)</w:t>
+      </w:r>
+      <w:r>
+        <w:tab/>
+      </w:r>
+      <w:r>
+        <w:t>8</w:t>
+      </w:r>
+    </w:p>
+    <w:p>
+      <w:pPr>
+        <w:pStyle w:val="9"/>
+        <w:tabs>
+          <w:tab w:val="right" w:leader="dot" w:pos="9026"/>
+        </w:tabs>
+        <w:spacing w:before="120" w:after="60"/>
+      </w:pPr>
+      <w:r>
+        <w:t>6. The hierarchy validator</w:t>
+      </w:r>
+      <w:r>
+        <w:tab/>
+      </w:r>
+      <w:r>
+        <w:t>13</w:t>
+      </w:r>
+    </w:p>
+    <w:p>
+      <w:pPr>
+        <w:pStyle w:val="9"/>
+        <w:tabs>
+          <w:tab w:val="right" w:leader="dot" w:pos="9026"/>
+        </w:tabs>
+        <w:spacing w:before="120" w:after="60"/>
+      </w:pPr>
+      <w:r>
+        <w:t>7. Viewport overlays</w:t>
+      </w:r>
+      <w:r>
+        <w:tab/>
+      </w:r>
+      <w:r>
+        <w:t>14</w:t>
+      </w:r>
+    </w:p>
+    <w:p>
+      <w:pPr>
+        <w:pStyle w:val="9"/>
+        <w:tabs>
+          <w:tab w:val="right" w:leader="dot" w:pos="9026"/>
+        </w:tabs>
+        <w:spacing w:before="120" w:after="60"/>
+      </w:pPr>
+      <w:r>
+        <w:t>8. Modes and tools</w:t>
+      </w:r>
+      <w:r>
+        <w:tab/>
+      </w:r>
+      <w:r>
+        <w:t>15</w:t>
+      </w:r>
+    </w:p>
+    <w:p>
+      <w:pPr>
+        <w:pStyle w:val="9"/>
+        <w:tabs>
+          <w:tab w:val="right" w:leader="dot" w:pos="9026"/>
+        </w:tabs>
+        <w:spacing w:before="120" w:after="60"/>
+      </w:pPr>
+      <w:r>
+        <w:t>9. Preferences</w:t>
+      </w:r>
+      <w:r>
+        <w:tab/>
+      </w:r>
+      <w:r>
+        <w:t>16</w:t>
+      </w:r>
+    </w:p>
+    <w:p>
+      <w:pPr>
+        <w:pStyle w:val="9"/>
+        <w:tabs>
+          <w:tab w:val="right" w:leader="dot" w:pos="9026"/>
+        </w:tabs>
+        <w:spacing w:before="120" w:after="60"/>
+      </w:pPr>
+      <w:r>
+        <w:t>10. How to use</w:t>
+      </w:r>
+      <w:r>
+        <w:tab/>
+      </w:r>
+      <w:r>
+        <w:t>17</w:t>
+      </w:r>
+    </w:p>
+    <w:p>
+      <w:pPr>
+        <w:pStyle w:val="9"/>
+        <w:tabs>
+          <w:tab w:val="right" w:leader="dot" w:pos="9026"/>
+        </w:tabs>
+        <w:spacing w:before="120" w:after="60"/>
+      </w:pPr>
+      <w:r>
+        <w:t>11. The Maya version</w:t>
+      </w:r>
+      <w:r>
+        <w:tab/>
+      </w:r>
+      <w:r>
+        <w:t>17</w:t>
+      </w:r>
+    </w:p>
+    <w:p>
+      <w:pPr>
+        <w:pStyle w:val="9"/>
+        <w:tabs>
+          <w:tab w:val="right" w:leader="dot" w:pos="9026"/>
+        </w:tabs>
+        <w:spacing w:before="120" w:after="60"/>
+      </w:pPr>
+      <w:r>
+        <w:t>12. Troubleshooting</w:t>
+      </w:r>
+      <w:r>
+        <w:tab/>
+      </w:r>
+      <w:r>
+        <w:t>19</w:t>
       </w:r>
     </w:p>
     <w:p>
@@ -206,6 +424,7 @@
           <w:left w:val="single" w:sz="24" w:space="8" w:color="C82823"/>
         </w:pBdr>
       </w:pPr>
+      <w:bookmarkStart w:id="100001" w:name="_Toc100001"/>
       <w:r>
         <w:rPr>
           <w:rFonts w:ascii="Century Gothic" w:hAnsi="Century Gothic"/>
@@ -225,14 +444,17 @@
         </w:rPr>
         <w:t>ABOUT STUKACH</w:t>
       </w:r>
+      <w:bookmarkEnd w:id="100001"/>
     </w:p>
     <w:p>
       <w:pPr>
         <w:pStyle w:val="Heading2"/>
       </w:pPr>
+      <w:bookmarkStart w:id="100002" w:name="_Toc100002"/>
       <w:r>
         <w:t>1.1 What STUKACH does</w:t>
       </w:r>
+      <w:bookmarkEnd w:id="100002"/>
     </w:p>
     <w:p>
       <w:r>
@@ -372,9 +594,11 @@
       <w:pPr>
         <w:pStyle w:val="Heading2"/>
       </w:pPr>
+      <w:bookmarkStart w:id="100003" w:name="_Toc100003"/>
       <w:r>
         <w:t>1.2 Philosophy: three severity levels</w:t>
       </w:r>
+      <w:bookmarkEnd w:id="100003"/>
     </w:p>
     <w:p>
       <w:r>
@@ -722,9 +946,11 @@
       <w:pPr>
         <w:pStyle w:val="Heading2"/>
       </w:pPr>
+      <w:bookmarkStart w:id="100004" w:name="_Toc100004"/>
       <w:r>
         <w:t>1.3 Two modes: Artist and Coordinator</w:t>
       </w:r>
+      <w:bookmarkEnd w:id="100004"/>
     </w:p>
     <w:p>
       <w:r>
@@ -741,9 +967,11 @@
       <w:pPr>
         <w:pStyle w:val="Heading2"/>
       </w:pPr>
+      <w:bookmarkStart w:id="100005" w:name="_Toc100005"/>
       <w:r>
         <w:t>1.4 Two versions</w:t>
       </w:r>
+      <w:bookmarkEnd w:id="100005"/>
     </w:p>
     <w:tbl>
       <w:tblPr>
@@ -1324,6 +1552,7 @@
           <w:left w:val="single" w:sz="24" w:space="8" w:color="C82823"/>
         </w:pBdr>
       </w:pPr>
+      <w:bookmarkStart w:id="100006" w:name="_Toc100006"/>
       <w:r>
         <w:rPr>
           <w:rFonts w:ascii="Century Gothic" w:hAnsi="Century Gothic"/>
@@ -1343,14 +1572,17 @@
         </w:rPr>
         <w:t>INSTALLATION</w:t>
       </w:r>
+      <w:bookmarkEnd w:id="100006"/>
     </w:p>
     <w:p>
       <w:pPr>
         <w:pStyle w:val="Heading2"/>
       </w:pPr>
+      <w:bookmarkStart w:id="100007" w:name="_Toc100007"/>
       <w:r>
         <w:t>2.1 Blender 5.1+</w:t>
       </w:r>
+      <w:bookmarkEnd w:id="100007"/>
     </w:p>
     <w:p>
       <w:pPr>
@@ -1437,9 +1669,11 @@
       <w:pPr>
         <w:pStyle w:val="Heading2"/>
       </w:pPr>
+      <w:bookmarkStart w:id="100008" w:name="_Toc100008"/>
       <w:r>
         <w:t>2.2 Maya 2025 (Windows x64)</w:t>
       </w:r>
+      <w:bookmarkEnd w:id="100008"/>
     </w:p>
     <w:p>
       <w:pPr>
@@ -1529,6 +1763,7 @@
           <w:left w:val="single" w:sz="24" w:space="8" w:color="C82823"/>
         </w:pBdr>
       </w:pPr>
+      <w:bookmarkStart w:id="100009" w:name="_Toc100009"/>
       <w:r>
         <w:rPr>
           <w:rFonts w:ascii="Century Gothic" w:hAnsi="Century Gothic"/>
@@ -1548,6 +1783,7 @@
         </w:rPr>
         <w:t>QUICK START (BLENDER)</w:t>
       </w:r>
+      <w:bookmarkEnd w:id="100009"/>
     </w:p>
     <w:p>
       <w:r>
@@ -1648,6 +1884,7 @@
           <w:left w:val="single" w:sz="24" w:space="8" w:color="C82823"/>
         </w:pBdr>
       </w:pPr>
+      <w:bookmarkStart w:id="100010" w:name="_Toc100010"/>
       <w:r>
         <w:rPr>
           <w:rFonts w:ascii="Century Gothic" w:hAnsi="Century Gothic"/>
@@ -1667,6 +1904,7 @@
         </w:rPr>
         <w:t>BLENDER VERSION INTERFACE</w:t>
       </w:r>
+      <w:bookmarkEnd w:id="100010"/>
     </w:p>
     <w:p>
       <w:r>
@@ -1683,9 +1921,11 @@
       <w:pPr>
         <w:pStyle w:val="Heading2"/>
       </w:pPr>
+      <w:bookmarkStart w:id="100011" w:name="_Toc100011"/>
       <w:r>
         <w:t>4.1 Run and modes</w:t>
       </w:r>
+      <w:bookmarkEnd w:id="100011"/>
     </w:p>
     <w:tbl>
       <w:tblPr>
@@ -1925,9 +2165,11 @@
       <w:pPr>
         <w:pStyle w:val="Heading2"/>
       </w:pPr>
+      <w:bookmarkStart w:id="100012" w:name="_Toc100012"/>
       <w:r>
         <w:t>4.2 Score and navigation</w:t>
       </w:r>
+      <w:bookmarkEnd w:id="100012"/>
     </w:p>
     <w:tbl>
       <w:tblPr>
@@ -2220,9 +2462,11 @@
       <w:pPr>
         <w:pStyle w:val="Heading2"/>
       </w:pPr>
+      <w:bookmarkStart w:id="100013" w:name="_Toc100013"/>
       <w:r>
         <w:t>4.3 Validation scope</w:t>
       </w:r>
+      <w:bookmarkEnd w:id="100013"/>
     </w:p>
     <w:tbl>
       <w:tblPr>
@@ -2515,9 +2759,11 @@
       <w:pPr>
         <w:pStyle w:val="Heading2"/>
       </w:pPr>
+      <w:bookmarkStart w:id="100014" w:name="_Toc100014"/>
       <w:r>
         <w:t>4.4 The Pipeline Checks block</w:t>
       </w:r>
+      <w:bookmarkEnd w:id="100014"/>
     </w:p>
     <w:p>
       <w:r>
@@ -2821,9 +3067,11 @@
       <w:pPr>
         <w:pStyle w:val="Heading2"/>
       </w:pPr>
+      <w:bookmarkStart w:id="100015" w:name="_Toc100015"/>
       <w:r>
         <w:t>4.5 The hierarchy block</w:t>
       </w:r>
+      <w:bookmarkEnd w:id="100015"/>
     </w:p>
     <w:p>
       <w:r>
@@ -2840,9 +3088,11 @@
       <w:pPr>
         <w:pStyle w:val="Heading2"/>
       </w:pPr>
+      <w:bookmarkStart w:id="100016" w:name="_Toc100016"/>
       <w:r>
         <w:t>4.6 The Objects list</w:t>
       </w:r>
+      <w:bookmarkEnd w:id="100016"/>
     </w:p>
     <w:tbl>
       <w:tblPr>
@@ -3294,9 +3544,11 @@
       <w:pPr>
         <w:pStyle w:val="Heading2"/>
       </w:pPr>
+      <w:bookmarkStart w:id="100017" w:name="_Toc100017"/>
       <w:r>
         <w:t>4.7 Asset Status and export</w:t>
       </w:r>
+      <w:bookmarkEnd w:id="100017"/>
     </w:p>
     <w:tbl>
       <w:tblPr>
@@ -3642,9 +3894,11 @@
       <w:pPr>
         <w:pStyle w:val="Heading2"/>
       </w:pPr>
+      <w:bookmarkStart w:id="100018" w:name="_Toc100018"/>
       <w:r>
         <w:t>4.8 The Coordinator panel</w:t>
       </w:r>
+      <w:bookmarkEnd w:id="100018"/>
     </w:p>
     <w:p>
       <w:r>
@@ -3664,6 +3918,7 @@
           <w:left w:val="single" w:sz="24" w:space="8" w:color="C82823"/>
         </w:pBdr>
       </w:pPr>
+      <w:bookmarkStart w:id="100019" w:name="_Toc100019"/>
       <w:r>
         <w:rPr>
           <w:rFonts w:ascii="Century Gothic" w:hAnsi="Century Gothic"/>
@@ -3683,6 +3938,7 @@
         </w:rPr>
         <w:t>CHECKERS (BLENDER)</w:t>
       </w:r>
+      <w:bookmarkEnd w:id="100019"/>
     </w:p>
     <w:p>
       <w:r>
@@ -3699,9 +3955,11 @@
       <w:pPr>
         <w:pStyle w:val="Heading2"/>
       </w:pPr>
+      <w:bookmarkStart w:id="100020" w:name="_Toc100020"/>
       <w:r>
         <w:t>5.1 Scene Units (scene)</w:t>
       </w:r>
+      <w:bookmarkEnd w:id="100020"/>
     </w:p>
     <w:tbl>
       <w:tblPr>
@@ -3933,9 +4191,11 @@
       <w:pPr>
         <w:pStyle w:val="Heading2"/>
       </w:pPr>
+      <w:bookmarkStart w:id="100021" w:name="_Toc100021"/>
       <w:r>
         <w:t>5.2 TOPOLOGY (14)</w:t>
       </w:r>
+      <w:bookmarkEnd w:id="100021"/>
     </w:p>
     <w:tbl>
       <w:tblPr>
@@ -5443,9 +5703,11 @@
       <w:pPr>
         <w:pStyle w:val="Heading2"/>
       </w:pPr>
+      <w:bookmarkStart w:id="100022" w:name="_Toc100022"/>
       <w:r>
         <w:t>5.3 TRANSFORMS (6)</w:t>
       </w:r>
+      <w:bookmarkEnd w:id="100022"/>
     </w:p>
     <w:tbl>
       <w:tblPr>
@@ -6188,9 +6450,11 @@
       <w:pPr>
         <w:pStyle w:val="Heading2"/>
       </w:pPr>
+      <w:bookmarkStart w:id="100023" w:name="_Toc100023"/>
       <w:r>
         <w:t>5.4 SYMMETRY (3)</w:t>
       </w:r>
+      <w:bookmarkEnd w:id="100023"/>
     </w:p>
     <w:tbl>
       <w:tblPr>
@@ -6423,9 +6687,11 @@
       <w:pPr>
         <w:pStyle w:val="Heading2"/>
       </w:pPr>
+      <w:bookmarkStart w:id="100024" w:name="_Toc100024"/>
       <w:r>
         <w:t>5.5 UV (9)</w:t>
       </w:r>
+      <w:bookmarkEnd w:id="100024"/>
     </w:p>
     <w:tbl>
       <w:tblPr>
@@ -7474,9 +7740,11 @@
       <w:pPr>
         <w:pStyle w:val="Heading2"/>
       </w:pPr>
+      <w:bookmarkStart w:id="100025" w:name="_Toc100025"/>
       <w:r>
         <w:t>5.6 NAMING (6)</w:t>
       </w:r>
+      <w:bookmarkEnd w:id="100025"/>
     </w:p>
     <w:p>
       <w:r>
@@ -8230,9 +8498,11 @@
       <w:pPr>
         <w:pStyle w:val="Heading2"/>
       </w:pPr>
+      <w:bookmarkStart w:id="100026" w:name="_Toc100026"/>
       <w:r>
         <w:t>5.7 MATERIALS (3)</w:t>
       </w:r>
+      <w:bookmarkEnd w:id="100026"/>
     </w:p>
     <w:tbl>
       <w:tblPr>
@@ -8669,9 +8939,11 @@
       <w:pPr>
         <w:pStyle w:val="Heading2"/>
       </w:pPr>
+      <w:bookmarkStart w:id="100027" w:name="_Toc100027"/>
       <w:r>
         <w:t>5.8 CLEANUP (1)</w:t>
       </w:r>
+      <w:bookmarkEnd w:id="100027"/>
     </w:p>
     <w:tbl>
       <w:tblPr>
@@ -8907,6 +9179,7 @@
           <w:left w:val="single" w:sz="24" w:space="8" w:color="C82823"/>
         </w:pBdr>
       </w:pPr>
+      <w:bookmarkStart w:id="100028" w:name="_Toc100028"/>
       <w:r>
         <w:rPr>
           <w:rFonts w:ascii="Century Gothic" w:hAnsi="Century Gothic"/>
@@ -8926,14 +9199,17 @@
         </w:rPr>
         <w:t>THE HIERARCHY VALIDATOR</w:t>
       </w:r>
+      <w:bookmarkEnd w:id="100028"/>
     </w:p>
     <w:p>
       <w:pPr>
         <w:pStyle w:val="Heading2"/>
       </w:pPr>
+      <w:bookmarkStart w:id="100029" w:name="_Toc100029"/>
       <w:r>
         <w:t>6.1 Asset structure conventions</w:t>
       </w:r>
+      <w:bookmarkEnd w:id="100029"/>
     </w:p>
     <w:p>
       <w:r>
@@ -9034,9 +9310,11 @@
       <w:pPr>
         <w:pStyle w:val="Heading2"/>
       </w:pPr>
+      <w:bookmarkStart w:id="100030" w:name="_Toc100030"/>
       <w:r>
         <w:t>6.2 Rules (13)</w:t>
       </w:r>
+      <w:bookmarkEnd w:id="100030"/>
     </w:p>
     <w:tbl>
       <w:tblPr>
@@ -10121,9 +10399,11 @@
       <w:pPr>
         <w:pStyle w:val="Heading2"/>
       </w:pPr>
+      <w:bookmarkStart w:id="100031" w:name="_Toc100031"/>
       <w:r>
         <w:t>6.3 Scanning</w:t>
       </w:r>
+      <w:bookmarkEnd w:id="100031"/>
     </w:p>
     <w:p>
       <w:pPr>
@@ -10185,9 +10465,11 @@
       <w:pPr>
         <w:pStyle w:val="Heading2"/>
       </w:pPr>
+      <w:bookmarkStart w:id="100032" w:name="_Toc100032"/>
       <w:r>
         <w:t>6.4 Fixes</w:t>
       </w:r>
+      <w:bookmarkEnd w:id="100032"/>
     </w:p>
     <w:tbl>
       <w:tblPr>
@@ -10544,9 +10826,11 @@
       <w:pPr>
         <w:pStyle w:val="Heading2"/>
       </w:pPr>
+      <w:bookmarkStart w:id="100033" w:name="_Toc100033"/>
       <w:r>
         <w:t>6.5 The coordinator gate</w:t>
       </w:r>
+      <w:bookmarkEnd w:id="100033"/>
     </w:p>
     <w:p>
       <w:r>
@@ -10566,6 +10850,7 @@
           <w:left w:val="single" w:sz="24" w:space="8" w:color="C82823"/>
         </w:pBdr>
       </w:pPr>
+      <w:bookmarkStart w:id="100034" w:name="_Toc100034"/>
       <w:r>
         <w:rPr>
           <w:rFonts w:ascii="Century Gothic" w:hAnsi="Century Gothic"/>
@@ -10585,6 +10870,7 @@
         </w:rPr>
         <w:t>VIEWPORT OVERLAYS</w:t>
       </w:r>
+      <w:bookmarkEnd w:id="100034"/>
     </w:p>
     <w:p>
       <w:r>
@@ -10991,6 +11277,7 @@
           <w:left w:val="single" w:sz="24" w:space="8" w:color="C82823"/>
         </w:pBdr>
       </w:pPr>
+      <w:bookmarkStart w:id="100035" w:name="_Toc100035"/>
       <w:r>
         <w:rPr>
           <w:rFonts w:ascii="Century Gothic" w:hAnsi="Century Gothic"/>
@@ -11010,14 +11297,17 @@
         </w:rPr>
         <w:t>MODES AND TOOLS</w:t>
       </w:r>
+      <w:bookmarkEnd w:id="100035"/>
     </w:p>
     <w:p>
       <w:pPr>
         <w:pStyle w:val="Heading2"/>
       </w:pPr>
+      <w:bookmarkStart w:id="100036" w:name="_Toc100036"/>
       <w:r>
         <w:t>8.1 Live</w:t>
       </w:r>
+      <w:bookmarkEnd w:id="100036"/>
     </w:p>
     <w:p>
       <w:r>
@@ -11034,9 +11324,11 @@
       <w:pPr>
         <w:pStyle w:val="Heading2"/>
       </w:pPr>
+      <w:bookmarkStart w:id="100037" w:name="_Toc100037"/>
       <w:r>
         <w:t>8.2 Presets</w:t>
       </w:r>
+      <w:bookmarkEnd w:id="100037"/>
     </w:p>
     <w:p>
       <w:r>
@@ -11053,9 +11345,11 @@
       <w:pPr>
         <w:pStyle w:val="Heading2"/>
       </w:pPr>
+      <w:bookmarkStart w:id="100038" w:name="_Toc100038"/>
       <w:r>
         <w:t>8.3 Reports</w:t>
       </w:r>
+      <w:bookmarkEnd w:id="100038"/>
     </w:p>
     <w:tbl>
       <w:tblPr>
@@ -11403,9 +11697,11 @@
       <w:pPr>
         <w:pStyle w:val="Heading2"/>
       </w:pPr>
+      <w:bookmarkStart w:id="100039" w:name="_Toc100039"/>
       <w:r>
         <w:t>8.4 Fixes</w:t>
       </w:r>
+      <w:bookmarkEnd w:id="100039"/>
     </w:p>
     <w:p>
       <w:r>
@@ -11422,9 +11718,11 @@
       <w:pPr>
         <w:pStyle w:val="Heading2"/>
       </w:pPr>
+      <w:bookmarkStart w:id="100040" w:name="_Toc100040"/>
       <w:r>
         <w:t>8.5 Checkpoint</w:t>
       </w:r>
+      <w:bookmarkEnd w:id="100040"/>
     </w:p>
     <w:p>
       <w:r>
@@ -11441,9 +11739,11 @@
       <w:pPr>
         <w:pStyle w:val="Heading2"/>
       </w:pPr>
+      <w:bookmarkStart w:id="100041" w:name="_Toc100041"/>
       <w:r>
         <w:t>8.6 Pre-flight</w:t>
       </w:r>
+      <w:bookmarkEnd w:id="100041"/>
     </w:p>
     <w:p>
       <w:r>
@@ -11460,9 +11760,11 @@
       <w:pPr>
         <w:pStyle w:val="Heading2"/>
       </w:pPr>
+      <w:bookmarkStart w:id="100042" w:name="_Toc100042"/>
       <w:r>
         <w:t>8.7 Logs and diagnostics</w:t>
       </w:r>
+      <w:bookmarkEnd w:id="100042"/>
     </w:p>
     <w:p>
       <w:pPr>
@@ -11513,6 +11815,7 @@
           <w:left w:val="single" w:sz="24" w:space="8" w:color="C82823"/>
         </w:pBdr>
       </w:pPr>
+      <w:bookmarkStart w:id="100043" w:name="_Toc100043"/>
       <w:r>
         <w:rPr>
           <w:rFonts w:ascii="Century Gothic" w:hAnsi="Century Gothic"/>
@@ -11532,6 +11835,7 @@
         </w:rPr>
         <w:t>PREFERENCES</w:t>
       </w:r>
+      <w:bookmarkEnd w:id="100043"/>
     </w:p>
     <w:p>
       <w:r>
@@ -11941,9 +12245,11 @@
       <w:pPr>
         <w:pStyle w:val="Heading2"/>
       </w:pPr>
+      <w:bookmarkStart w:id="100044" w:name="_Toc100044"/>
       <w:r>
         <w:t>9.1 Updates</w:t>
       </w:r>
+      <w:bookmarkEnd w:id="100044"/>
     </w:p>
     <w:p>
       <w:r>
@@ -12005,6 +12311,7 @@
           <w:left w:val="single" w:sz="24" w:space="8" w:color="C82823"/>
         </w:pBdr>
       </w:pPr>
+      <w:bookmarkStart w:id="100045" w:name="_Toc100045"/>
       <w:r>
         <w:rPr>
           <w:rFonts w:ascii="Century Gothic" w:hAnsi="Century Gothic"/>
@@ -12024,14 +12331,17 @@
         </w:rPr>
         <w:t>HOW TO USE</w:t>
       </w:r>
+      <w:bookmarkEnd w:id="100045"/>
     </w:p>
     <w:p>
       <w:pPr>
         <w:pStyle w:val="Heading2"/>
       </w:pPr>
+      <w:bookmarkStart w:id="100046" w:name="_Toc100046"/>
       <w:r>
         <w:t>10.1 For the artist</w:t>
       </w:r>
+      <w:bookmarkEnd w:id="100046"/>
     </w:p>
     <w:p>
       <w:pPr>
@@ -12121,9 +12431,11 @@
       <w:pPr>
         <w:pStyle w:val="Heading2"/>
       </w:pPr>
+      <w:bookmarkStart w:id="100047" w:name="_Toc100047"/>
       <w:r>
         <w:t>10.2 For the coordinator</w:t>
       </w:r>
+      <w:bookmarkEnd w:id="100047"/>
     </w:p>
     <w:p>
       <w:pPr>
@@ -12202,6 +12514,7 @@
           <w:left w:val="single" w:sz="24" w:space="8" w:color="C82823"/>
         </w:pBdr>
       </w:pPr>
+      <w:bookmarkStart w:id="100048" w:name="_Toc100048"/>
       <w:r>
         <w:rPr>
           <w:rFonts w:ascii="Century Gothic" w:hAnsi="Century Gothic"/>
@@ -12221,14 +12534,17 @@
         </w:rPr>
         <w:t>THE MAYA VERSION</w:t>
       </w:r>
+      <w:bookmarkEnd w:id="100048"/>
     </w:p>
     <w:p>
       <w:pPr>
         <w:pStyle w:val="Heading2"/>
       </w:pPr>
+      <w:bookmarkStart w:id="100049" w:name="_Toc100049"/>
       <w:r>
         <w:t>11.1 The panel</w:t>
       </w:r>
+      <w:bookmarkEnd w:id="100049"/>
     </w:p>
     <w:p>
       <w:r>
@@ -12245,9 +12561,11 @@
       <w:pPr>
         <w:pStyle w:val="Heading2"/>
       </w:pPr>
+      <w:bookmarkStart w:id="100050" w:name="_Toc100050"/>
       <w:r>
         <w:t>11.2 Checks: 43 + two scene checks</w:t>
       </w:r>
+      <w:bookmarkEnd w:id="100050"/>
     </w:p>
     <w:tbl>
       <w:tblPr>
@@ -12969,9 +13287,11 @@
       <w:pPr>
         <w:pStyle w:val="Heading2"/>
       </w:pPr>
+      <w:bookmarkStart w:id="100051" w:name="_Toc100051"/>
       <w:r>
         <w:t>11.3 Speed: the snapshot and progressive validation</w:t>
       </w:r>
+      <w:bookmarkEnd w:id="100051"/>
     </w:p>
     <w:p>
       <w:r>
@@ -12999,9 +13319,11 @@
       <w:pPr>
         <w:pStyle w:val="Heading2"/>
       </w:pPr>
+      <w:bookmarkStart w:id="100052" w:name="_Toc100052"/>
       <w:r>
         <w:t>11.4 The overlay</w:t>
       </w:r>
+      <w:bookmarkEnd w:id="100052"/>
     </w:p>
     <w:p>
       <w:r>
@@ -13018,9 +13340,11 @@
       <w:pPr>
         <w:pStyle w:val="Heading2"/>
       </w:pPr>
+      <w:bookmarkStart w:id="100053" w:name="_Toc100053"/>
       <w:r>
         <w:t>11.5 Locator hierarchy</w:t>
       </w:r>
+      <w:bookmarkEnd w:id="100053"/>
     </w:p>
     <w:p>
       <w:pPr>
@@ -13068,9 +13392,11 @@
       <w:pPr>
         <w:pStyle w:val="Heading2"/>
       </w:pPr>
+      <w:bookmarkStart w:id="100054" w:name="_Toc100054"/>
       <w:r>
         <w:t>11.6 Maya version notes</w:t>
       </w:r>
+      <w:bookmarkEnd w:id="100054"/>
     </w:p>
     <w:p>
       <w:pPr>
@@ -13149,6 +13475,7 @@
           <w:left w:val="single" w:sz="24" w:space="8" w:color="C82823"/>
         </w:pBdr>
       </w:pPr>
+      <w:bookmarkStart w:id="100055" w:name="_Toc100055"/>
       <w:r>
         <w:rPr>
           <w:rFonts w:ascii="Century Gothic" w:hAnsi="Century Gothic"/>
@@ -13168,6 +13495,7 @@
         </w:rPr>
         <w:t>TROUBLESHOOTING</w:t>
       </w:r>
+      <w:bookmarkEnd w:id="100055"/>
     </w:p>
     <w:p>
       <w:r>
@@ -25884,6 +26212,53 @@
       </w:tcPr>
     </w:tblStylePr>
   </w:style>
+  <w:style xmlns:w="http://schemas.openxmlformats.org/wordprocessingml/2006/main" w:type="paragraph" w:styleId="9">
+    <w:name w:val="toc 1"/>
+    <w:basedOn w:val="Normal"/>
+    <w:uiPriority w:val="39"/>
+    <w:pPr>
+      <w:tabs>
+        <w:tab w:val="right" w:leader="dot" w:pos="9026"/>
+      </w:tabs>
+      <w:spacing w:before="120" w:after="60"/>
+    </w:pPr>
+    <w:rPr>
+      <w:b/>
+      <w:bCs/>
+    </w:rPr>
+  </w:style>
+  <w:style xmlns:w="http://schemas.openxmlformats.org/wordprocessingml/2006/main" w:type="paragraph" w:styleId="11">
+    <w:name w:val="toc 2"/>
+    <w:basedOn w:val="Normal"/>
+    <w:uiPriority w:val="39"/>
+    <w:pPr>
+      <w:tabs>
+        <w:tab w:val="right" w:leader="dot" w:pos="9026"/>
+      </w:tabs>
+      <w:ind w:left="360"/>
+      <w:spacing w:before="60" w:after="40"/>
+    </w:pPr>
+  </w:style>
+  <w:style xmlns:w="http://schemas.openxmlformats.org/wordprocessingml/2006/main" w:type="paragraph" w:styleId="12">
+    <w:name w:val="toc 3"/>
+    <w:basedOn w:val="Normal"/>
+    <w:uiPriority w:val="39"/>
+    <w:pPr>
+      <w:tabs>
+        <w:tab w:val="right" w:leader="dot" w:pos="9026"/>
+      </w:tabs>
+      <w:ind w:left="720"/>
+      <w:spacing w:before="40" w:after="20"/>
+    </w:pPr>
+  </w:style>
+  <w:style xmlns:w="http://schemas.openxmlformats.org/wordprocessingml/2006/main" w:type="character" w:styleId="Hyperlink">
+    <w:name w:val="Hyperlink"/>
+    <w:uiPriority w:val="99"/>
+    <w:rPr>
+      <w:color w:val="0563C1"/>
+      <w:u w:val="single"/>
+    </w:rPr>
+  </w:style>
 </w:styles>
 </file>
 

</xml_diff>

<commit_message>
feat: support Blender 4.2+ (min version lowered from 5.1)
The manifest blocked install on 4.2-4.5 with 'Incompatible' while the
code has no 5.x-only API: recent additions are guarded (has_custom_normals
via getattr, tomllib fallback, prefs reads in try/except), and the rest of
the codebase predates the 5.x line. Drops the non-standard [tools] table.
READMEs and both manuals updated (4.2+, tested on 5.2).
</commit_message>
<xml_diff>
--- a/docs/STUKACH_Manual_EN.docx
+++ b/docs/STUKACH_Manual_EN.docx
@@ -1194,7 +1194,7 @@
                 <w:color w:val="1A1A1A"/>
                 <w:sz w:val="18"/>
               </w:rPr>
-              <w:t>Blender 5.1+ extension (zip)</w:t>
+              <w:t>Blender 4.2+ extension (zip)</w:t>
             </w:r>
           </w:p>
         </w:tc>
@@ -1580,7 +1580,7 @@
       </w:pPr>
       <w:bookmarkStart w:id="100007" w:name="_Toc100007"/>
       <w:r>
-        <w:t>2.1 Blender 5.1+</w:t>
+        <w:t>2.1 Blender 4.2+</w:t>
       </w:r>
       <w:bookmarkEnd w:id="100007"/>
     </w:p>

</xml_diff>

<commit_message>
docs: manuals v1.8.2 — Ngons BLOCKER severity, version strings
</commit_message>
<xml_diff>
--- a/docs/STUKACH_Manual_EN.docx
+++ b/docs/STUKACH_Manual_EN.docx
@@ -104,7 +104,7 @@
                 <w:sz w:val="18"/>
                 <w:spacing w:val="60"/>
               </w:rPr>
-              <w:t>BLENDER 5.2  -  V1.8.0  ·  MAYA 2025 - V1.3.0</w:t>
+              <w:t>BLENDER 5.2  -  V1.8.2  ·  MAYA 2025 - V1.3.0</w:t>
             </w:r>
           </w:p>
           <w:p>
@@ -1117,7 +1117,7 @@
                 <w:color w:val="1A1A1A"/>
                 <w:sz w:val="18"/>
               </w:rPr>
-              <w:t>v1.8.0</w:t>
+              <w:t>v1.8.2</w:t>
             </w:r>
           </w:p>
         </w:tc>
@@ -3948,7 +3948,7 @@
           <w:color w:val="1A1A1A"/>
           <w:sz w:val="19"/>
         </w:rPr>
-        <w:t>42 checks in 7 categories + Scene Units. The set and severity match the v1.8.0 code; thresholds of some checks are configurable in Preferences (the UV tab, the Checks tab - the Hard Edges chamfer width). Update checking is described in section 9.1.</w:t>
+        <w:t>42 checks in 7 categories + Scene Units. The set and severity match the v1.8.2 code; thresholds of some checks are configurable in Preferences (the UV tab, the Checks tab - the Hard Edges chamfer width). Update checking is described in section 9.1.</w:t>
       </w:r>
     </w:p>
     <w:p>
@@ -4943,7 +4943,7 @@
             <w:tcBorders>
               <w:bottom w:val="single" w:sz="4" w:space="4" w:color="E0E0E0"/>
             </w:tcBorders>
-            <w:shd w:val="clear" w:color="auto" w:fill="FFF3CD"/>
+            <w:shd w:val="clear" w:color="auto" w:fill="FDE9E9"/>
           </w:tcPr>
           <w:p>
             <w:pPr>
@@ -4953,10 +4953,10 @@
               <w:rPr>
                 <w:rFonts w:ascii="Arial" w:hAnsi="Arial"/>
                 <w:b/>
-                <w:color w:val="7F6000"/>
+                <w:color w:val="C00000"/>
                 <w:sz w:val="18"/>
               </w:rPr>
-              <w:t>WARNING</w:t>
+              <w:t>BLOCKER</w:t>
             </w:r>
           </w:p>
         </w:tc>
@@ -5002,7 +5002,7 @@
                 <w:color w:val="1A1A1A"/>
                 <w:sz w:val="18"/>
               </w:rPr>
-              <w:t>They triangulate unpredictably in the renderer; normal artifacts on hard surfaces</w:t>
+              <w:t>Not allowed in the pipeline: they triangulate unpredictably in the renderer. One-click fix: triangulation</w:t>
             </w:r>
           </w:p>
         </w:tc>

</xml_diff>

<commit_message>
docs: manuals v1.8.4 - hierarchy redesign and naming panel rework
Section 6 rewritten for the one-mode hierarchy block: 10 structural
rules (naming rules belong to the NAMING category now, root_name_mismatch
added), rule rows with on-row fixes, clean roots as single lines,
Skeleton in the block header. NAMING section: configuration lives in
Preferences only, the scene audit runs inside Validate, non-ASCII names
are errors, mesh data accepts _mesh/_geo/_grp. Version strings to V1.8.4.
Visual acceptance: both PDFs pass full-page review (20/20 each).
</commit_message>
<xml_diff>
--- a/docs/STUKACH_Manual_EN.docx
+++ b/docs/STUKACH_Manual_EN.docx
@@ -104,7 +104,7 @@
                 <w:sz w:val="18"/>
                 <w:spacing w:val="60"/>
               </w:rPr>
-              <w:t>BLENDER 5.2  -  V1.8.2  ·  MAYA 2025 - V1.3.0</w:t>
+              <w:t>BLENDER 5.2  -  V1.8.4  ·  MAYA 2025 - V1.3.0</w:t>
             </w:r>
           </w:p>
           <w:p>
@@ -309,7 +309,7 @@
         <w:tab/>
       </w:r>
       <w:r>
-        <w:t>14</w:t>
+        <w:t>15</w:t>
       </w:r>
     </w:p>
     <w:p>
@@ -381,7 +381,7 @@
         <w:tab/>
       </w:r>
       <w:r>
-        <w:t>17</w:t>
+        <w:t>18</w:t>
       </w:r>
     </w:p>
     <w:p>
@@ -503,7 +503,7 @@
           <w:color w:val="1A1A1A"/>
           <w:sz w:val="19"/>
         </w:rPr>
-        <w:t>asset hierarchy validator - 13 structure rules (roots, layers, groups, branch naming);</w:t>
+        <w:t>asset hierarchy validator - 10 structure rules (roots, layers, groups, branch naming);</w:t>
       </w:r>
     </w:p>
     <w:p>
@@ -1117,7 +1117,7 @@
                 <w:color w:val="1A1A1A"/>
                 <w:sz w:val="18"/>
               </w:rPr>
-              <w:t>v1.8.2</w:t>
+              <w:t>v1.8.4</w:t>
             </w:r>
           </w:p>
         </w:tc>
@@ -1425,7 +1425,7 @@
                 <w:color w:val="1A1A1A"/>
                 <w:sz w:val="18"/>
               </w:rPr>
-              <w:t>13-rule validator + fixes</w:t>
+              <w:t>10-rule validator + fixes</w:t>
             </w:r>
           </w:p>
         </w:tc>
@@ -3081,7 +3081,7 @@
           <w:color w:val="1A1A1A"/>
           <w:sz w:val="19"/>
         </w:rPr>
-        <w:t>Sits right after the NAMING category. The Scan button runs the scene structure check against pipeline conventions (see section 6): asset roots, functional layers, partitions, group suffixes. Findings are aggregated per rule - one row per rule with example objects, expanded by click. Issues only mode hides clean branches. In Live mode the scan reruns itself whenever the scene structure changes (the main scenario - accepting an asset after an FBX import).</w:t>
+        <w:t>Sits right after the NAMING category. Scan runs the scene structure check against pipeline conventions (see section 6): asset roots, functional layers, partitions, group suffixes. One display mode - problems only, grouped by asset root: a section per root, rule rows inside ("Missing group suffix ×5") with name samples, expanding to objects; the Fix button sits on the rule row. A clean root is a single line with a checkmark. Skeleton - the asset skeleton generator, a button in the block header. A collapsed block shows its status in the header row (Clean / 3E · 2W / Stale). In Live mode the scan reruns itself whenever the scene structure changes (the main scenario - accepting an asset after an FBX import).</w:t>
       </w:r>
     </w:p>
     <w:p>
@@ -3948,7 +3948,7 @@
           <w:color w:val="1A1A1A"/>
           <w:sz w:val="19"/>
         </w:rPr>
-        <w:t>42 checks in 7 categories + Scene Units. The set and severity match the v1.8.2 code; thresholds of some checks are configurable in Preferences (the UV tab, the Checks tab - the Hard Edges chamfer width). Update checking is described in section 9.1.</w:t>
+        <w:t>42 checks in 7 categories + Scene Units. The set and severity match the v1.8.4 code; thresholds of some checks are configurable in Preferences (the UV tab, the Checks tab - the Hard Edges chamfer width). Update checking is described in section 9.1.</w:t>
       </w:r>
     </w:p>
     <w:p>
@@ -7754,7 +7754,7 @@
           <w:color w:val="1A1A1A"/>
           <w:sz w:val="19"/>
         </w:rPr>
-        <w:t>Naming rules are configured in Preferences - Naming (object/group prefixes and suffixes, mesh data; see section 9). The checks compare names against this policy.</w:t>
+        <w:t>Naming rules are configured in Preferences - Naming (object/group prefixes and suffixes, mesh data; see section 9); the panel has no configuration fields. The checks compare names against this policy; the scene-wide naming audit runs together with Validate (the Naming Audit row shows the status).</w:t>
       </w:r>
     </w:p>
     <w:tbl>
@@ -7953,7 +7953,7 @@
                 <w:color w:val="1A1A1A"/>
                 <w:sz w:val="18"/>
               </w:rPr>
-              <w:t>Default names (Cube, pCube1), .001 numbering, special characters, capital letters, prefix/suffix mismatches</w:t>
+              <w:t>Default names (Cube, pCube1), .001 numbering, special characters, capital letters, Cyrillic and any non-ASCII characters, prefix/suffix mismatches</w:t>
             </w:r>
           </w:p>
         </w:tc>
@@ -8157,7 +8157,7 @@
                 <w:color w:val="1A1A1A"/>
                 <w:sz w:val="18"/>
               </w:rPr>
-              <w:t>A mesh datablock name (Mesh.101) not matching the object name</w:t>
+              <w:t>A mesh datablock name (Mesh.101) matching neither the object name nor one of the suffixes (_mesh / _geo / _grp)</w:t>
             </w:r>
           </w:p>
         </w:tc>
@@ -9247,6 +9247,20 @@
           <w:color w:val="1A1A1A"/>
           <w:sz w:val="19"/>
         </w:rPr>
+        <w:t>the root group name equals the asset name (taken from the .blend filename);</w:t>
+      </w:r>
+    </w:p>
+    <w:p>
+      <w:pPr>
+        <w:pStyle w:val="ListBullet"/>
+      </w:pPr>
+      <w:r>
+        <w:rPr>
+          <w:rFonts w:ascii="Arial" w:hAnsi="Arial"/>
+          <w:i w:val="0"/>
+          <w:color w:val="1A1A1A"/>
+          <w:sz w:val="19"/>
+        </w:rPr>
         <w:t>inside - functional layers (geo, proxy, rig, wip etc.): the set is free, with a built-in whitelist of 24 common names, extendable in Preferences;</w:t>
       </w:r>
     </w:p>
@@ -9289,21 +9303,7 @@
           <w:color w:val="1A1A1A"/>
           <w:sz w:val="19"/>
         </w:rPr>
-        <w:t>names are lowercase, no .001, no forbidden characters, no default DCC names;</w:t>
-      </w:r>
-    </w:p>
-    <w:p>
-      <w:pPr>
-        <w:pStyle w:val="ListBullet"/>
-      </w:pPr>
-      <w:r>
-        <w:rPr>
-          <w:rFonts w:ascii="Arial" w:hAnsi="Arial"/>
-          <w:i w:val="0"/>
-          <w:color w:val="1A1A1A"/>
-          <w:sz w:val="19"/>
-        </w:rPr>
-        <w:t>lights and cameras are not part of the asset structure and are not validated; a static asset may be grouped right at the root.</w:t>
+        <w:t>object naming (case, characters, .001, default DCC names) is the NAMING category's job (§5.6) - the hierarchy does not duplicate it; lights and cameras are not part of the asset structure and are not validated; a static asset may be grouped right at the root.</w:t>
       </w:r>
     </w:p>
     <w:p>
@@ -9312,7 +9312,7 @@
       </w:pPr>
       <w:bookmarkStart w:id="100030" w:name="_Toc100030"/>
       <w:r>
-        <w:t>6.2 Rules (13)</w:t>
+        <w:t>6.2 Rules (10)</w:t>
       </w:r>
       <w:bookmarkEnd w:id="100030"/>
     </w:p>
@@ -9437,7 +9437,7 @@
                 <w:color w:val="1A1A1A"/>
                 <w:sz w:val="18"/>
               </w:rPr>
-              <w:t>Blender numbering (.001)</w:t>
+              <w:t>Missing group suffix</w:t>
             </w:r>
           </w:p>
         </w:tc>
@@ -9484,7 +9484,7 @@
                 <w:color w:val="1A1A1A"/>
                 <w:sz w:val="18"/>
               </w:rPr>
-              <w:t>Copies with .001 auto-numbering - a sign of duplication instead of renaming</w:t>
+              <w:t>A group with a group role missing the _grp suffix</w:t>
             </w:r>
           </w:p>
         </w:tc>
@@ -9512,7 +9512,7 @@
                 <w:color w:val="1A1A1A"/>
                 <w:sz w:val="18"/>
               </w:rPr>
-              <w:t>Missing group suffix</w:t>
+              <w:t>Empty group</w:t>
             </w:r>
           </w:p>
         </w:tc>
@@ -9559,7 +9559,7 @@
                 <w:color w:val="1A1A1A"/>
                 <w:sz w:val="18"/>
               </w:rPr>
-              <w:t>A group with a group role missing the _grp suffix</w:t>
+              <w:t>An empty with a group role and no children - an unfilled locator after import</w:t>
             </w:r>
           </w:p>
         </w:tc>
@@ -9587,7 +9587,7 @@
                 <w:color w:val="1A1A1A"/>
                 <w:sz w:val="18"/>
               </w:rPr>
-              <w:t>Forbidden characters</w:t>
+              <w:t>Root name ≠ asset name</w:t>
             </w:r>
           </w:p>
         </w:tc>
@@ -9598,7 +9598,7 @@
             <w:tcBorders>
               <w:bottom w:val="single" w:sz="4" w:space="4" w:color="E0E0E0"/>
             </w:tcBorders>
-            <w:shd w:val="clear" w:color="auto" w:fill="FDE9E9"/>
+            <w:shd w:val="clear" w:color="auto" w:fill="FFF3CD"/>
           </w:tcPr>
           <w:p>
             <w:pPr>
@@ -9608,10 +9608,10 @@
               <w:rPr>
                 <w:rFonts w:ascii="Arial" w:hAnsi="Arial"/>
                 <w:b/>
-                <w:color w:val="C00000"/>
+                <w:color w:val="7F6000"/>
                 <w:sz w:val="18"/>
               </w:rPr>
-              <w:t>ERROR</w:t>
+              <w:t>WARNING</w:t>
             </w:r>
           </w:p>
         </w:tc>
@@ -9634,7 +9634,7 @@
                 <w:color w:val="1A1A1A"/>
                 <w:sz w:val="18"/>
               </w:rPr>
-              <w:t>Forbidden characters in node names</w:t>
+              <w:t>The scene has a single root, but its name does not equal the asset name (from the .blend filename) - one of them was renamed</w:t>
             </w:r>
           </w:p>
         </w:tc>
@@ -9662,7 +9662,7 @@
                 <w:color w:val="1A1A1A"/>
                 <w:sz w:val="18"/>
               </w:rPr>
-              <w:t>Default DCC name</w:t>
+              <w:t>Unknown functional layer</w:t>
             </w:r>
           </w:p>
         </w:tc>
@@ -9673,7 +9673,7 @@
             <w:tcBorders>
               <w:bottom w:val="single" w:sz="4" w:space="4" w:color="E0E0E0"/>
             </w:tcBorders>
-            <w:shd w:val="clear" w:color="auto" w:fill="FDE9E9"/>
+            <w:shd w:val="clear" w:color="auto" w:fill="FFF3CD"/>
           </w:tcPr>
           <w:p>
             <w:pPr>
@@ -9683,10 +9683,10 @@
               <w:rPr>
                 <w:rFonts w:ascii="Arial" w:hAnsi="Arial"/>
                 <w:b/>
-                <w:color w:val="C00000"/>
+                <w:color w:val="7F6000"/>
                 <w:sz w:val="18"/>
               </w:rPr>
-              <w:t>ERROR</w:t>
+              <w:t>WARNING</w:t>
             </w:r>
           </w:p>
         </w:tc>
@@ -9709,7 +9709,7 @@
                 <w:color w:val="1A1A1A"/>
                 <w:sz w:val="18"/>
               </w:rPr>
-              <w:t>Default package names (Cube, Empty, pCube1...)</w:t>
+              <w:t>A layer outside the whitelist (extended in Preferences)</w:t>
             </w:r>
           </w:p>
         </w:tc>
@@ -9737,7 +9737,7 @@
                 <w:color w:val="1A1A1A"/>
                 <w:sz w:val="18"/>
               </w:rPr>
-              <w:t>Empty group</w:t>
+              <w:t>Orphan empty</w:t>
             </w:r>
           </w:p>
         </w:tc>
@@ -9748,7 +9748,7 @@
             <w:tcBorders>
               <w:bottom w:val="single" w:sz="4" w:space="4" w:color="E0E0E0"/>
             </w:tcBorders>
-            <w:shd w:val="clear" w:color="auto" w:fill="FDE9E9"/>
+            <w:shd w:val="clear" w:color="auto" w:fill="FFF3CD"/>
           </w:tcPr>
           <w:p>
             <w:pPr>
@@ -9758,10 +9758,10 @@
               <w:rPr>
                 <w:rFonts w:ascii="Arial" w:hAnsi="Arial"/>
                 <w:b/>
-                <w:color w:val="C00000"/>
+                <w:color w:val="7F6000"/>
                 <w:sz w:val="18"/>
               </w:rPr>
-              <w:t>ERROR</w:t>
+              <w:t>WARNING</w:t>
             </w:r>
           </w:p>
         </w:tc>
@@ -9784,7 +9784,7 @@
                 <w:color w:val="1A1A1A"/>
                 <w:sz w:val="18"/>
               </w:rPr>
-              <w:t>An empty with a group role and no children - an unfilled locator after import</w:t>
+              <w:t>An empty unreachable from any asset root</w:t>
             </w:r>
           </w:p>
         </w:tc>
@@ -9812,7 +9812,7 @@
                 <w:color w:val="1A1A1A"/>
                 <w:sz w:val="18"/>
               </w:rPr>
-              <w:t>Uppercase in name</w:t>
+              <w:t>Orphan mesh</w:t>
             </w:r>
           </w:p>
         </w:tc>
@@ -9859,7 +9859,7 @@
                 <w:color w:val="1A1A1A"/>
                 <w:sz w:val="18"/>
               </w:rPr>
-              <w:t>Capital letters in the name</w:t>
+              <w:t>A mesh unreachable from any asset root</w:t>
             </w:r>
           </w:p>
         </w:tc>
@@ -9887,7 +9887,7 @@
                 <w:color w:val="1A1A1A"/>
                 <w:sz w:val="18"/>
               </w:rPr>
-              <w:t>Unknown functional layer</w:t>
+              <w:t>Name mismatch in group</w:t>
             </w:r>
           </w:p>
         </w:tc>
@@ -9934,232 +9934,7 @@
                 <w:color w:val="1A1A1A"/>
                 <w:sz w:val="18"/>
               </w:rPr>
-              <w:t>A layer outside the whitelist (extended in Preferences)</w:t>
-            </w:r>
-          </w:p>
-        </w:tc>
-      </w:tr>
-      <w:tr>
-        <w:trPr>
-          <w:cantSplit/>
-        </w:trPr>
-        <w:tc>
-          <w:tcPr>
-            <w:tcW w:type="dxa" w:w="2948"/>
-            <w:vAlign w:val="top"/>
-            <w:tcBorders>
-              <w:bottom w:val="single" w:sz="4" w:space="4" w:color="E0E0E0"/>
-            </w:tcBorders>
-          </w:tcPr>
-          <w:p>
-            <w:pPr>
-              <w:spacing w:before="40" w:after="40" w:line="264" w:lineRule="auto"/>
-            </w:pPr>
-            <w:r>
-              <w:rPr>
-                <w:rFonts w:ascii="Arial" w:hAnsi="Arial"/>
-                <w:b/>
-                <w:color w:val="1A1A1A"/>
-                <w:sz w:val="18"/>
-              </w:rPr>
-              <w:t>Orphan empty</w:t>
-            </w:r>
-          </w:p>
-        </w:tc>
-        <w:tc>
-          <w:tcPr>
-            <w:tcW w:type="dxa" w:w="1587"/>
-            <w:vAlign w:val="top"/>
-            <w:tcBorders>
-              <w:bottom w:val="single" w:sz="4" w:space="4" w:color="E0E0E0"/>
-            </w:tcBorders>
-            <w:shd w:val="clear" w:color="auto" w:fill="FFF3CD"/>
-          </w:tcPr>
-          <w:p>
-            <w:pPr>
-              <w:spacing w:before="40" w:after="40" w:line="264" w:lineRule="auto"/>
-            </w:pPr>
-            <w:r>
-              <w:rPr>
-                <w:rFonts w:ascii="Arial" w:hAnsi="Arial"/>
-                <w:b/>
-                <w:color w:val="7F6000"/>
-                <w:sz w:val="18"/>
-              </w:rPr>
-              <w:t>WARNING</w:t>
-            </w:r>
-          </w:p>
-        </w:tc>
-        <w:tc>
-          <w:tcPr>
-            <w:tcW w:type="dxa" w:w="5953"/>
-            <w:vAlign w:val="top"/>
-            <w:tcBorders>
-              <w:bottom w:val="single" w:sz="4" w:space="4" w:color="E0E0E0"/>
-            </w:tcBorders>
-          </w:tcPr>
-          <w:p>
-            <w:pPr>
-              <w:spacing w:before="40" w:after="40" w:line="264" w:lineRule="auto"/>
-            </w:pPr>
-            <w:r>
-              <w:rPr>
-                <w:rFonts w:ascii="Arial" w:hAnsi="Arial"/>
-                <w:b w:val="0"/>
-                <w:color w:val="1A1A1A"/>
-                <w:sz w:val="18"/>
-              </w:rPr>
-              <w:t>An empty unreachable from any asset root</w:t>
-            </w:r>
-          </w:p>
-        </w:tc>
-      </w:tr>
-      <w:tr>
-        <w:trPr>
-          <w:cantSplit/>
-        </w:trPr>
-        <w:tc>
-          <w:tcPr>
-            <w:tcW w:type="dxa" w:w="2948"/>
-            <w:vAlign w:val="top"/>
-            <w:tcBorders>
-              <w:bottom w:val="single" w:sz="4" w:space="4" w:color="E0E0E0"/>
-            </w:tcBorders>
-          </w:tcPr>
-          <w:p>
-            <w:pPr>
-              <w:spacing w:before="40" w:after="40" w:line="264" w:lineRule="auto"/>
-            </w:pPr>
-            <w:r>
-              <w:rPr>
-                <w:rFonts w:ascii="Arial" w:hAnsi="Arial"/>
-                <w:b/>
-                <w:color w:val="1A1A1A"/>
-                <w:sz w:val="18"/>
-              </w:rPr>
-              <w:t>Orphan mesh</w:t>
-            </w:r>
-          </w:p>
-        </w:tc>
-        <w:tc>
-          <w:tcPr>
-            <w:tcW w:type="dxa" w:w="1587"/>
-            <w:vAlign w:val="top"/>
-            <w:tcBorders>
-              <w:bottom w:val="single" w:sz="4" w:space="4" w:color="E0E0E0"/>
-            </w:tcBorders>
-            <w:shd w:val="clear" w:color="auto" w:fill="FFF3CD"/>
-          </w:tcPr>
-          <w:p>
-            <w:pPr>
-              <w:spacing w:before="40" w:after="40" w:line="264" w:lineRule="auto"/>
-            </w:pPr>
-            <w:r>
-              <w:rPr>
-                <w:rFonts w:ascii="Arial" w:hAnsi="Arial"/>
-                <w:b/>
-                <w:color w:val="7F6000"/>
-                <w:sz w:val="18"/>
-              </w:rPr>
-              <w:t>WARNING</w:t>
-            </w:r>
-          </w:p>
-        </w:tc>
-        <w:tc>
-          <w:tcPr>
-            <w:tcW w:type="dxa" w:w="5953"/>
-            <w:vAlign w:val="top"/>
-            <w:tcBorders>
-              <w:bottom w:val="single" w:sz="4" w:space="4" w:color="E0E0E0"/>
-            </w:tcBorders>
-          </w:tcPr>
-          <w:p>
-            <w:pPr>
-              <w:spacing w:before="40" w:after="40" w:line="264" w:lineRule="auto"/>
-            </w:pPr>
-            <w:r>
-              <w:rPr>
-                <w:rFonts w:ascii="Arial" w:hAnsi="Arial"/>
-                <w:b w:val="0"/>
-                <w:color w:val="1A1A1A"/>
-                <w:sz w:val="18"/>
-              </w:rPr>
-              <w:t>A mesh unreachable from any asset root</w:t>
-            </w:r>
-          </w:p>
-        </w:tc>
-      </w:tr>
-      <w:tr>
-        <w:trPr>
-          <w:cantSplit/>
-        </w:trPr>
-        <w:tc>
-          <w:tcPr>
-            <w:tcW w:type="dxa" w:w="2948"/>
-            <w:vAlign w:val="top"/>
-            <w:tcBorders>
-              <w:bottom w:val="single" w:sz="4" w:space="4" w:color="E0E0E0"/>
-            </w:tcBorders>
-          </w:tcPr>
-          <w:p>
-            <w:pPr>
-              <w:spacing w:before="40" w:after="40" w:line="264" w:lineRule="auto"/>
-            </w:pPr>
-            <w:r>
-              <w:rPr>
-                <w:rFonts w:ascii="Arial" w:hAnsi="Arial"/>
-                <w:b/>
-                <w:color w:val="1A1A1A"/>
-                <w:sz w:val="18"/>
-              </w:rPr>
-              <w:t>Name mismatch in group</w:t>
-            </w:r>
-          </w:p>
-        </w:tc>
-        <w:tc>
-          <w:tcPr>
-            <w:tcW w:type="dxa" w:w="1587"/>
-            <w:vAlign w:val="top"/>
-            <w:tcBorders>
-              <w:bottom w:val="single" w:sz="4" w:space="4" w:color="E0E0E0"/>
-            </w:tcBorders>
-            <w:shd w:val="clear" w:color="auto" w:fill="FFF3CD"/>
-          </w:tcPr>
-          <w:p>
-            <w:pPr>
-              <w:spacing w:before="40" w:after="40" w:line="264" w:lineRule="auto"/>
-            </w:pPr>
-            <w:r>
-              <w:rPr>
-                <w:rFonts w:ascii="Arial" w:hAnsi="Arial"/>
-                <w:b/>
-                <w:color w:val="7F6000"/>
-                <w:sz w:val="18"/>
-              </w:rPr>
-              <w:t>WARNING</w:t>
-            </w:r>
-          </w:p>
-        </w:tc>
-        <w:tc>
-          <w:tcPr>
-            <w:tcW w:type="dxa" w:w="5953"/>
-            <w:vAlign w:val="top"/>
-            <w:tcBorders>
-              <w:bottom w:val="single" w:sz="4" w:space="4" w:color="E0E0E0"/>
-            </w:tcBorders>
-          </w:tcPr>
-          <w:p>
-            <w:pPr>
-              <w:spacing w:before="40" w:after="40" w:line="264" w:lineRule="auto"/>
-            </w:pPr>
-            <w:r>
-              <w:rPr>
-                <w:rFonts w:ascii="Arial" w:hAnsi="Arial"/>
-                <w:b w:val="0"/>
-                <w:color w:val="1A1A1A"/>
-                <w:sz w:val="18"/>
-              </w:rPr>
-              <w:t>A node name not matching the &lt;base&gt; / &lt;base&gt;_NN pattern of its group</w:t>
+              <w:t>A mesh name (without the _geo suffix) matching none of the legal forms of its group: &lt;base&gt;, &lt;base&gt;_NN (two digits), &lt;base&gt;_a (a single letter), &lt;base&gt;_a_NN, the _l / _r symmetry</w:t>
             </w:r>
           </w:p>
         </w:tc>
@@ -10416,7 +10191,7 @@
           <w:color w:val="1A1A1A"/>
           <w:sz w:val="19"/>
         </w:rPr>
-        <w:t>Scan - a manual scan start; the result is collapsible sections per asset root with their own ERROR/WARNING counters, plus "Not connected to any root" and scene-level finding sections.</w:t>
+        <w:t>Scan (in the block header; an icon-only re-scan once a result exists). The result is sections per asset root with their own E/W counters; a clean root is a single line with a checkmark. Inside a root the findings collapse into rule rows (×N + name samples) that expand to objects (up to 10 rows). Orphans get their own "Not connected to any root" section; scene-level findings (no/multiple roots) sit on top of the list.</w:t>
       </w:r>
     </w:p>
     <w:p>
@@ -10430,7 +10205,7 @@
           <w:color w:val="1A1A1A"/>
           <w:sz w:val="19"/>
         </w:rPr>
-        <w:t>Issues only - show problem branches only.</w:t>
+        <w:t>Live auto-scan: with Live enabled the scan reruns itself after structure changes (an FBX import, reparenting, renames). "Stale - re-scan" in the header means the result is outdated.</w:t>
       </w:r>
     </w:p>
     <w:p>
@@ -10444,21 +10219,7 @@
           <w:color w:val="1A1A1A"/>
           <w:sz w:val="19"/>
         </w:rPr>
-        <w:t>Live auto-scan: with Live enabled the scan reruns itself after structure changes (an FBX import, reparenting, renames). A "Stale" badge means the result is outdated - run Scan.</w:t>
-      </w:r>
-    </w:p>
-    <w:p>
-      <w:pPr>
-        <w:pStyle w:val="ListBullet"/>
-      </w:pPr>
-      <w:r>
-        <w:rPr>
-          <w:rFonts w:ascii="Arial" w:hAnsi="Arial"/>
-          <w:i w:val="0"/>
-          <w:color w:val="1A1A1A"/>
-          <w:sz w:val="19"/>
-        </w:rPr>
-        <w:t>An X on a finding - ignore the rule on that node; the "N ignored - clear" counter resets the ignores.</w:t>
+        <w:t>An X on a finding - ignore the rule on that node; "N ignored - clear" in the status resets the ignores. Ignores are respected by the panel, the asset status, the reports and Next Issue.</w:t>
       </w:r>
     </w:p>
     <w:p>
@@ -10470,6 +10231,17 @@
         <w:t>6.4 Fixes</w:t>
       </w:r>
       <w:bookmarkEnd w:id="100032"/>
+    </w:p>
+    <w:p>
+      <w:r>
+        <w:rPr>
+          <w:rFonts w:ascii="Arial" w:hAnsi="Arial"/>
+          <w:i w:val="0"/>
+          <w:color w:val="1A1A1A"/>
+          <w:sz w:val="19"/>
+        </w:rPr>
+        <w:t>The Fix button sits on the rule row - visible only where there is something to fix:</w:t>
+      </w:r>
     </w:p>
     <w:tbl>
       <w:tblPr>
@@ -10484,8 +10256,9 @@
         </w:tblCellMar>
       </w:tblPr>
       <w:tblGrid>
-        <w:gridCol w:w="4706"/>
-        <w:gridCol w:w="4706"/>
+        <w:gridCol w:w="3137"/>
+        <w:gridCol w:w="3137"/>
+        <w:gridCol w:w="3137"/>
       </w:tblGrid>
       <w:tr>
         <w:trPr>
@@ -10493,7 +10266,7 @@
         </w:trPr>
         <w:tc>
           <w:tcPr>
-            <w:tcW w:type="dxa" w:w="2551"/>
+            <w:tcW w:type="dxa" w:w="2041"/>
             <w:vAlign w:val="top"/>
             <w:tcBorders>
               <w:bottom w:val="single" w:sz="12" w:space="4" w:color="C82823"/>
@@ -10518,7 +10291,7 @@
         </w:tc>
         <w:tc>
           <w:tcPr>
-            <w:tcW w:type="dxa" w:w="7937"/>
+            <w:tcW w:type="dxa" w:w="3061"/>
             <w:vAlign w:val="top"/>
             <w:tcBorders>
               <w:bottom w:val="single" w:sz="12" w:space="4" w:color="C82823"/>
@@ -10537,6 +10310,31 @@
                 <w:sz w:val="17"/>
                 <w:spacing w:val="20"/>
               </w:rPr>
+              <w:t>WHERE</w:t>
+            </w:r>
+          </w:p>
+        </w:tc>
+        <w:tc>
+          <w:tcPr>
+            <w:tcW w:type="dxa" w:w="5386"/>
+            <w:vAlign w:val="top"/>
+            <w:tcBorders>
+              <w:bottom w:val="single" w:sz="12" w:space="4" w:color="C82823"/>
+            </w:tcBorders>
+          </w:tcPr>
+          <w:p>
+            <w:pPr>
+              <w:keepNext/>
+              <w:spacing w:before="40" w:after="40" w:line="264" w:lineRule="auto"/>
+            </w:pPr>
+            <w:r>
+              <w:rPr>
+                <w:rFonts w:ascii="Century Gothic" w:hAnsi="Century Gothic"/>
+                <w:b/>
+                <w:color w:val="000000"/>
+                <w:sz w:val="17"/>
+                <w:spacing w:val="20"/>
+              </w:rPr>
               <w:t>WHAT IT DOES</w:t>
             </w:r>
           </w:p>
@@ -10548,7 +10346,7 @@
         </w:trPr>
         <w:tc>
           <w:tcPr>
-            <w:tcW w:type="dxa" w:w="2551"/>
+            <w:tcW w:type="dxa" w:w="2041"/>
             <w:vAlign w:val="top"/>
             <w:tcBorders>
               <w:bottom w:val="single" w:sz="4" w:space="4" w:color="E0E0E0"/>
@@ -10572,7 +10370,31 @@
         </w:tc>
         <w:tc>
           <w:tcPr>
-            <w:tcW w:type="dxa" w:w="7937"/>
+            <w:tcW w:type="dxa" w:w="3061"/>
+            <w:vAlign w:val="top"/>
+            <w:tcBorders>
+              <w:bottom w:val="single" w:sz="4" w:space="4" w:color="E0E0E0"/>
+            </w:tcBorders>
+          </w:tcPr>
+          <w:p>
+            <w:pPr>
+              <w:keepNext/>
+              <w:spacing w:before="40" w:after="40" w:line="264" w:lineRule="auto"/>
+            </w:pPr>
+            <w:r>
+              <w:rPr>
+                <w:rFonts w:ascii="Arial" w:hAnsi="Arial"/>
+                <w:b w:val="0"/>
+                <w:color w:val="1A1A1A"/>
+                <w:sz w:val="18"/>
+              </w:rPr>
+              <w:t>Missing group suffix row</w:t>
+            </w:r>
+          </w:p>
+        </w:tc>
+        <w:tc>
+          <w:tcPr>
+            <w:tcW w:type="dxa" w:w="5386"/>
             <w:vAlign w:val="top"/>
             <w:tcBorders>
               <w:bottom w:val="single" w:sz="4" w:space="4" w:color="E0E0E0"/>
@@ -10601,7 +10423,7 @@
         </w:trPr>
         <w:tc>
           <w:tcPr>
-            <w:tcW w:type="dxa" w:w="2551"/>
+            <w:tcW w:type="dxa" w:w="2041"/>
             <w:vAlign w:val="top"/>
             <w:tcBorders>
               <w:bottom w:val="single" w:sz="4" w:space="4" w:color="E0E0E0"/>
@@ -10619,13 +10441,13 @@
                 <w:color w:val="1A1A1A"/>
                 <w:sz w:val="18"/>
               </w:rPr>
-              <w:t>Renumber</w:t>
-            </w:r>
-          </w:p>
-        </w:tc>
-        <w:tc>
-          <w:tcPr>
-            <w:tcW w:type="dxa" w:w="7937"/>
+              <w:t>Fix (Renumber)</w:t>
+            </w:r>
+          </w:p>
+        </w:tc>
+        <w:tc>
+          <w:tcPr>
+            <w:tcW w:type="dxa" w:w="3061"/>
             <w:vAlign w:val="top"/>
             <w:tcBorders>
               <w:bottom w:val="single" w:sz="4" w:space="4" w:color="E0E0E0"/>
@@ -10643,7 +10465,31 @@
                 <w:color w:val="1A1A1A"/>
                 <w:sz w:val="18"/>
               </w:rPr>
-              <w:t>Brings partition numbering to the two-digit base_01 grid (legal names are untouched; the rename is two-pass through temporary names - collision-free)</w:t>
+              <w:t>Name mismatch in group row</w:t>
+            </w:r>
+          </w:p>
+        </w:tc>
+        <w:tc>
+          <w:tcPr>
+            <w:tcW w:type="dxa" w:w="5386"/>
+            <w:vAlign w:val="top"/>
+            <w:tcBorders>
+              <w:bottom w:val="single" w:sz="4" w:space="4" w:color="E0E0E0"/>
+            </w:tcBorders>
+          </w:tcPr>
+          <w:p>
+            <w:pPr>
+              <w:keepNext/>
+              <w:spacing w:before="40" w:after="40" w:line="264" w:lineRule="auto"/>
+            </w:pPr>
+            <w:r>
+              <w:rPr>
+                <w:rFonts w:ascii="Arial" w:hAnsi="Arial"/>
+                <w:b w:val="0"/>
+                <w:color w:val="1A1A1A"/>
+                <w:sz w:val="18"/>
+              </w:rPr>
+              <w:t>Brings partition numbering to the two-digit base_01 grid, keeping the mesh suffix (_geo). Legal names (window_a_01, wing_front_l) are untouched; the rename is two-pass - collision-free</w:t>
             </w:r>
           </w:p>
         </w:tc>
@@ -10654,7 +10500,7 @@
         </w:trPr>
         <w:tc>
           <w:tcPr>
-            <w:tcW w:type="dxa" w:w="2551"/>
+            <w:tcW w:type="dxa" w:w="2041"/>
             <w:vAlign w:val="top"/>
             <w:tcBorders>
               <w:bottom w:val="single" w:sz="4" w:space="4" w:color="E0E0E0"/>
@@ -10672,13 +10518,13 @@
                 <w:color w:val="1A1A1A"/>
                 <w:sz w:val="18"/>
               </w:rPr>
-              <w:t>Adopt Orphans</w:t>
-            </w:r>
-          </w:p>
-        </w:tc>
-        <w:tc>
-          <w:tcPr>
-            <w:tcW w:type="dxa" w:w="7937"/>
+              <w:t>Create root</w:t>
+            </w:r>
+          </w:p>
+        </w:tc>
+        <w:tc>
+          <w:tcPr>
+            <w:tcW w:type="dxa" w:w="3061"/>
             <w:vAlign w:val="top"/>
             <w:tcBorders>
               <w:bottom w:val="single" w:sz="4" w:space="4" w:color="E0E0E0"/>
@@ -10696,7 +10542,31 @@
                 <w:color w:val="1A1A1A"/>
                 <w:sz w:val="18"/>
               </w:rPr>
-              <w:t>Connects orphaned nodes to a root: one root - automatically, several - with a dialog</w:t>
+              <w:t>No asset root row</w:t>
+            </w:r>
+          </w:p>
+        </w:tc>
+        <w:tc>
+          <w:tcPr>
+            <w:tcW w:type="dxa" w:w="5386"/>
+            <w:vAlign w:val="top"/>
+            <w:tcBorders>
+              <w:bottom w:val="single" w:sz="4" w:space="4" w:color="E0E0E0"/>
+            </w:tcBorders>
+          </w:tcPr>
+          <w:p>
+            <w:pPr>
+              <w:keepNext/>
+              <w:spacing w:before="40" w:after="40" w:line="264" w:lineRule="auto"/>
+            </w:pPr>
+            <w:r>
+              <w:rPr>
+                <w:rFonts w:ascii="Arial" w:hAnsi="Arial"/>
+                <w:b w:val="0"/>
+                <w:color w:val="1A1A1A"/>
+                <w:sz w:val="18"/>
+              </w:rPr>
+              <w:t>Creates an asset root; an option to adopt the orphans right away</w:t>
             </w:r>
           </w:p>
         </w:tc>
@@ -10707,7 +10577,7 @@
         </w:trPr>
         <w:tc>
           <w:tcPr>
-            <w:tcW w:type="dxa" w:w="2551"/>
+            <w:tcW w:type="dxa" w:w="2041"/>
             <w:vAlign w:val="top"/>
             <w:tcBorders>
               <w:bottom w:val="single" w:sz="4" w:space="4" w:color="E0E0E0"/>
@@ -10725,13 +10595,13 @@
                 <w:color w:val="1A1A1A"/>
                 <w:sz w:val="18"/>
               </w:rPr>
-              <w:t>Create Root</w:t>
-            </w:r>
-          </w:p>
-        </w:tc>
-        <w:tc>
-          <w:tcPr>
-            <w:tcW w:type="dxa" w:w="7937"/>
+              <w:t>Connect</w:t>
+            </w:r>
+          </w:p>
+        </w:tc>
+        <w:tc>
+          <w:tcPr>
+            <w:tcW w:type="dxa" w:w="3061"/>
             <w:vAlign w:val="top"/>
             <w:tcBorders>
               <w:bottom w:val="single" w:sz="4" w:space="4" w:color="E0E0E0"/>
@@ -10749,7 +10619,31 @@
                 <w:color w:val="1A1A1A"/>
                 <w:sz w:val="18"/>
               </w:rPr>
-              <w:t>Creates an asset root; an option to adopt the orphans right away</w:t>
+              <w:t>the orphans section</w:t>
+            </w:r>
+          </w:p>
+        </w:tc>
+        <w:tc>
+          <w:tcPr>
+            <w:tcW w:type="dxa" w:w="5386"/>
+            <w:vAlign w:val="top"/>
+            <w:tcBorders>
+              <w:bottom w:val="single" w:sz="4" w:space="4" w:color="E0E0E0"/>
+            </w:tcBorders>
+          </w:tcPr>
+          <w:p>
+            <w:pPr>
+              <w:keepNext/>
+              <w:spacing w:before="40" w:after="40" w:line="264" w:lineRule="auto"/>
+            </w:pPr>
+            <w:r>
+              <w:rPr>
+                <w:rFonts w:ascii="Arial" w:hAnsi="Arial"/>
+                <w:b w:val="0"/>
+                <w:color w:val="1A1A1A"/>
+                <w:sz w:val="18"/>
+              </w:rPr>
+              <w:t>Connects orphaned nodes to a root: one root - automatically, several - with a dialog</w:t>
             </w:r>
           </w:p>
         </w:tc>
@@ -10760,7 +10654,7 @@
         </w:trPr>
         <w:tc>
           <w:tcPr>
-            <w:tcW w:type="dxa" w:w="2551"/>
+            <w:tcW w:type="dxa" w:w="2041"/>
             <w:vAlign w:val="top"/>
             <w:tcBorders>
               <w:bottom w:val="single" w:sz="8" w:space="4" w:color="000000"/>
@@ -10777,13 +10671,36 @@
                 <w:color w:val="1A1A1A"/>
                 <w:sz w:val="18"/>
               </w:rPr>
-              <w:t>Create Asset Skeleton</w:t>
-            </w:r>
-          </w:p>
-        </w:tc>
-        <w:tc>
-          <w:tcPr>
-            <w:tcW w:type="dxa" w:w="7937"/>
+              <w:t>Skeleton</w:t>
+            </w:r>
+          </w:p>
+        </w:tc>
+        <w:tc>
+          <w:tcPr>
+            <w:tcW w:type="dxa" w:w="3061"/>
+            <w:vAlign w:val="top"/>
+            <w:tcBorders>
+              <w:bottom w:val="single" w:sz="8" w:space="4" w:color="000000"/>
+            </w:tcBorders>
+          </w:tcPr>
+          <w:p>
+            <w:pPr>
+              <w:spacing w:before="40" w:after="40" w:line="264" w:lineRule="auto"/>
+            </w:pPr>
+            <w:r>
+              <w:rPr>
+                <w:rFonts w:ascii="Arial" w:hAnsi="Arial"/>
+                <w:b w:val="0"/>
+                <w:color w:val="1A1A1A"/>
+                <w:sz w:val="18"/>
+              </w:rPr>
+              <w:t>the block header</w:t>
+            </w:r>
+          </w:p>
+        </w:tc>
+        <w:tc>
+          <w:tcPr>
+            <w:tcW w:type="dxa" w:w="5386"/>
             <w:vAlign w:val="top"/>
             <w:tcBorders>
               <w:bottom w:val="single" w:sz="8" w:space="4" w:color="000000"/>
@@ -10819,7 +10736,7 @@
           <w:color w:val="6E6E6E"/>
           <w:sz w:val="18"/>
         </w:rPr>
-        <w:t>Every hierarchy fix rescans the structure right after applying.</w:t>
+        <w:t>Every hierarchy fix rescans the structure right after applying. In Coordinator Mode with Coordinator Lock the fixes and Skeleton are hidden - the coordinator only validates.</w:t>
       </w:r>
     </w:p>
     <w:p>
@@ -12126,7 +12043,7 @@
                 <w:color w:val="1A1A1A"/>
                 <w:sz w:val="18"/>
               </w:rPr>
-              <w:t>Objects and Groups: prefix/suffix lists (+/-); Mesh Data: the datablock suffix (_mesh by default); Hierarchy: the group suffix (_grp) and the functional whitelist (extends the 24 built-in layers).</w:t>
+              <w:t>Objects and Groups: prefix/suffix lists (+/-); Mesh Data: the datablock suffix list (_mesh, _geo, _grp by default; the first entry is the Fix button's target); Hierarchy: the group suffix (_grp) and the functional whitelist (extends the 24 built-in layers). The panel itself has no naming fields anymore - configuration lives here and in presets only.</w:t>
             </w:r>
           </w:p>
         </w:tc>

</xml_diff>

<commit_message>
docs: manuals v1.8.5 - the naming contract
Section 5.6 describes the contract (one name shape shown in the panel,
three group toggles, findings in the Naming block); Preferences gains
Contract Positions; version strings to V1.8.5.  Both PDFs passed the
full-page visual review.
</commit_message>
<xml_diff>
--- a/docs/STUKACH_Manual_EN.docx
+++ b/docs/STUKACH_Manual_EN.docx
@@ -104,7 +104,7 @@
                 <w:sz w:val="18"/>
                 <w:spacing w:val="60"/>
               </w:rPr>
-              <w:t>BLENDER 5.2  -  V1.8.4  ·  MAYA 2025 - V1.3.0</w:t>
+              <w:t>BLENDER 5.2  -  V1.8.5  ·  MAYA 2025 - V1.3.0</w:t>
             </w:r>
           </w:p>
           <w:p>
@@ -1117,7 +1117,7 @@
                 <w:color w:val="1A1A1A"/>
                 <w:sz w:val="18"/>
               </w:rPr>
-              <w:t>v1.8.4</w:t>
+              <w:t>v1.8.5</w:t>
             </w:r>
           </w:p>
         </w:tc>
@@ -3948,7 +3948,7 @@
           <w:color w:val="1A1A1A"/>
           <w:sz w:val="19"/>
         </w:rPr>
-        <w:t>42 checks in 7 categories + Scene Units. The set and severity match the v1.8.4 code; thresholds of some checks are configurable in Preferences (the UV tab, the Checks tab - the Hard Edges chamfer width). Update checking is described in section 9.1.</w:t>
+        <w:t>42 checks in 7 categories + Scene Units. The set and severity match the v1.8.5 code; thresholds of some checks are configurable in Preferences (the UV tab, the Checks tab - the Hard Edges chamfer width). Update checking is described in section 9.1.</w:t>
       </w:r>
     </w:p>
     <w:p>
@@ -7754,7 +7754,7 @@
           <w:color w:val="1A1A1A"/>
           <w:sz w:val="19"/>
         </w:rPr>
-        <w:t>Naming rules are configured in Preferences - Naming (object/group prefixes and suffixes, mesh data; see section 9); the panel has no configuration fields. The checks compare names against this policy; the scene-wide naming audit runs together with Validate (the Naming Audit row shows the status).</w:t>
+        <w:t>Naming is validated by the contract - a single name shape assembled from the policy: [prefix] core [position] [_a] [_01] suffix. Slots are configured in Preferences - Naming (prefixes, suffixes, positions; see section 9); the variant is a single a-z letter, the number is two digits. The expected pattern is shown right in the Naming block; a mismatch produces a single finding quoting it. Hygiene stays separate: ASCII, lowercase, no .001, no default DCC names, no duplicates. The scene audit runs together with Validate; findings live in the Naming block and object cards do not repeat them. The checkboxes collapse into three group toggles: Object Naming / Mesh Data / Materials.</w:t>
       </w:r>
     </w:p>
     <w:tbl>
@@ -7953,7 +7953,7 @@
                 <w:color w:val="1A1A1A"/>
                 <w:sz w:val="18"/>
               </w:rPr>
-              <w:t>Default names (Cube, pCube1), .001 numbering, special characters, capital letters, Cyrillic and any non-ASCII characters, prefix/suffix mismatches</w:t>
+              <w:t>Default names (Cube, pCube1), .001 numbering, special characters, capital letters, Cyrillic and any non-ASCII characters, name-contract mismatches</w:t>
             </w:r>
           </w:p>
         </w:tc>
@@ -12043,7 +12043,7 @@
                 <w:color w:val="1A1A1A"/>
                 <w:sz w:val="18"/>
               </w:rPr>
-              <w:t>Objects and Groups: prefix/suffix lists (+/-); Mesh Data: the datablock suffix list (_mesh, _geo, _grp by default; the first entry is the Fix button's target); Hierarchy: the group suffix (_grp) and the functional whitelist (extends the 24 built-in layers). The panel itself has no naming fields anymore - configuration lives here and in presets only.</w:t>
+              <w:t>Objects and Groups: prefix/suffix lists (+/-); Contract Positions: extra position tokens (extending the 8 built-ins _l/_r/_front/_back/_top/_bottom/_left/_right); Mesh Data: the datablock suffix list (_mesh, _geo, _grp by default; the first entry is the Fix button's target); Hierarchy: the group suffix (_grp) and the functional whitelist (extends the 24 built-in layers). The panel itself has no naming fields - configuration lives here and in presets only.</w:t>
             </w:r>
           </w:p>
         </w:tc>

</xml_diff>